<commit_message>
Diario de reflexión fase 2
</commit_message>
<xml_diff>
--- a/Fase 2/Evidencias Individuales/Lopez_Hernan_2.1_APT122_DiarioReflexionFase2.docx
+++ b/Fase 2/Evidencias Individuales/Lopez_Hernan_2.1_APT122_DiarioReflexionFase2.docx
@@ -1,6 +1,6 @@
 
 <file path=word/document.xml><?xml version="1.0" encoding="utf-8"?>
-<w:document xmlns:wpc="http://schemas.microsoft.com/office/word/2010/wordprocessingCanvas" xmlns:cx="http://schemas.microsoft.com/office/drawing/2014/chartex" xmlns:mc="http://schemas.openxmlformats.org/markup-compatibility/2006" xmlns:o="urn:schemas-microsoft-com:office:office" xmlns:r="http://schemas.openxmlformats.org/officeDocument/2006/relationships" xmlns:m="http://schemas.openxmlformats.org/officeDocument/2006/math" xmlns:v="urn:schemas-microsoft-com:vml" xmlns:wp14="http://schemas.microsoft.com/office/word/2010/wordprocessingDrawing" xmlns:wp="http://schemas.openxmlformats.org/drawingml/2006/wordprocessingDrawing" xmlns:w10="urn:schemas-microsoft-com:office:word" xmlns:w="http://schemas.openxmlformats.org/wordprocessingml/2006/main" xmlns:w14="http://schemas.microsoft.com/office/word/2010/wordml" xmlns:w15="http://schemas.microsoft.com/office/word/2012/wordml" xmlns:w16se="http://schemas.microsoft.com/office/word/2015/wordml/symex" xmlns:wpg="http://schemas.microsoft.com/office/word/2010/wordprocessingGroup" xmlns:wpi="http://schemas.microsoft.com/office/word/2010/wordprocessingInk" xmlns:wne="http://schemas.microsoft.com/office/word/2006/wordml" xmlns:wps="http://schemas.microsoft.com/office/word/2010/wordprocessingShape" mc:Ignorable="w14 w15 w16se wp14">
+<w:document xmlns:wpc="http://schemas.microsoft.com/office/word/2010/wordprocessingCanvas" xmlns:cx="http://schemas.microsoft.com/office/drawing/2014/chartex" xmlns:cx1="http://schemas.microsoft.com/office/drawing/2015/9/8/chartex" xmlns:cx2="http://schemas.microsoft.com/office/drawing/2015/10/21/chartex" xmlns:cx3="http://schemas.microsoft.com/office/drawing/2016/5/9/chartex" xmlns:cx4="http://schemas.microsoft.com/office/drawing/2016/5/10/chartex" xmlns:cx5="http://schemas.microsoft.com/office/drawing/2016/5/11/chartex" xmlns:cx6="http://schemas.microsoft.com/office/drawing/2016/5/12/chartex" xmlns:cx7="http://schemas.microsoft.com/office/drawing/2016/5/13/chartex" xmlns:cx8="http://schemas.microsoft.com/office/drawing/2016/5/14/chartex" xmlns:mc="http://schemas.openxmlformats.org/markup-compatibility/2006" xmlns:aink="http://schemas.microsoft.com/office/drawing/2016/ink" xmlns:am3d="http://schemas.microsoft.com/office/drawing/2017/model3d" xmlns:o="urn:schemas-microsoft-com:office:office" xmlns:oel="http://schemas.microsoft.com/office/2019/extlst" xmlns:r="http://schemas.openxmlformats.org/officeDocument/2006/relationships" xmlns:m="http://schemas.openxmlformats.org/officeDocument/2006/math" xmlns:v="urn:schemas-microsoft-com:vml" xmlns:wp14="http://schemas.microsoft.com/office/word/2010/wordprocessingDrawing" xmlns:wp="http://schemas.openxmlformats.org/drawingml/2006/wordprocessingDrawing" xmlns:w10="urn:schemas-microsoft-com:office:word" xmlns:w="http://schemas.openxmlformats.org/wordprocessingml/2006/main" xmlns:w14="http://schemas.microsoft.com/office/word/2010/wordml" xmlns:w15="http://schemas.microsoft.com/office/word/2012/wordml" xmlns:w16cex="http://schemas.microsoft.com/office/word/2018/wordml/cex" xmlns:w16cid="http://schemas.microsoft.com/office/word/2016/wordml/cid" xmlns:w16="http://schemas.microsoft.com/office/word/2018/wordml" xmlns:w16du="http://schemas.microsoft.com/office/word/2023/wordml/word16du" xmlns:w16sdtdh="http://schemas.microsoft.com/office/word/2020/wordml/sdtdatahash" xmlns:w16sdtfl="http://schemas.microsoft.com/office/word/2024/wordml/sdtformatlock" xmlns:w16se="http://schemas.microsoft.com/office/word/2015/wordml/symex" xmlns:wpg="http://schemas.microsoft.com/office/word/2010/wordprocessingGroup" xmlns:wpi="http://schemas.microsoft.com/office/word/2010/wordprocessingInk" xmlns:wne="http://schemas.microsoft.com/office/word/2006/wordml" xmlns:wps="http://schemas.microsoft.com/office/word/2010/wordprocessingShape" mc:Ignorable="w14 w15 w16se w16cid w16 w16cex w16sdtdh w16sdtfl w16du wp14">
   <w:body>
     <w:p/>
     <w:tbl>
@@ -293,7 +293,7 @@
       </w:tr>
       <w:tr>
         <w:trPr>
-          <w:trHeight w:val="1639"/>
+          <w:trHeight w:val="2499"/>
         </w:trPr>
         <w:tc>
           <w:tcPr>
@@ -335,34 +335,37 @@
             <w:pPr>
               <w:jc w:val="both"/>
               <w:rPr>
-                <w:rFonts w:ascii="Calibri" w:hAnsi="Calibri"/>
-                <w:b/>
-                <w:bCs/>
-                <w:color w:val="1F4E79" w:themeColor="accent1" w:themeShade="80"/>
+                <w:rFonts w:eastAsiaTheme="majorEastAsia"/>
+                <w:sz w:val="24"/>
+                <w:szCs w:val="24"/>
               </w:rPr>
             </w:pPr>
+            <w:r>
+              <w:rPr>
+                <w:rFonts w:eastAsiaTheme="majorEastAsia"/>
+                <w:sz w:val="24"/>
+                <w:szCs w:val="24"/>
+              </w:rPr>
+              <w:t>No he podido cumplir todas las actividades exactamente en los tiempos definidos, pero sí las más importantes de mi etapa, y el avance general es bueno. Algunas tareas se movieron de fecha porque aparecieron imprevistos y cambios en lo que se esperaba del proyecto.</w:t>
+            </w:r>
           </w:p>
           <w:p>
             <w:pPr>
               <w:jc w:val="both"/>
               <w:rPr>
-                <w:rFonts w:ascii="Calibri" w:hAnsi="Calibri"/>
-                <w:b/>
-                <w:bCs/>
-                <w:color w:val="1F4E79" w:themeColor="accent1" w:themeShade="80"/>
+                <w:rFonts w:eastAsiaTheme="majorEastAsia"/>
+                <w:sz w:val="24"/>
+                <w:szCs w:val="24"/>
               </w:rPr>
             </w:pPr>
-          </w:p>
-          <w:p>
-            <w:pPr>
-              <w:jc w:val="both"/>
+            <w:r>
               <w:rPr>
-                <w:rFonts w:ascii="Calibri" w:hAnsi="Calibri"/>
-                <w:b/>
-                <w:bCs/>
-                <w:color w:val="1F4E79" w:themeColor="accent1" w:themeShade="80"/>
+                <w:rFonts w:eastAsiaTheme="majorEastAsia"/>
+                <w:sz w:val="24"/>
+                <w:szCs w:val="24"/>
               </w:rPr>
-            </w:pPr>
+              <w:t>Lo que me ha facilitado el trabajo es la forma en que nos organizamos: un tablero compartido, tareas claras para cada uno y una reunión semanal con el cliente que nos permite validar rápido y corregir el rumbo. Lo que me ha dificultado son los imprevistos que tomaron más tiempo del estimado, el cambio de dirección que tuvo el proyecto hace pocos días y la dependencia de información que debe entregar el cliente.</w:t>
+            </w:r>
           </w:p>
         </w:tc>
       </w:tr>
@@ -472,9 +475,20 @@
               <w:jc w:val="both"/>
               <w:rPr>
                 <w:rFonts w:ascii="Calibri" w:hAnsi="Calibri"/>
-                <w:b/>
-                <w:bCs/>
-                <w:color w:val="1F4E79" w:themeColor="accent1" w:themeShade="80"/>
+              </w:rPr>
+            </w:pPr>
+            <w:r>
+              <w:rPr>
+                <w:rFonts w:ascii="Calibri" w:hAnsi="Calibri"/>
+              </w:rPr>
+              <w:t>Frente a los imprevistos, he buscado entender bien el origen del problema antes de actuar, en vez de reaccionar a cada molestia por separado. Eso me ha ahorrado tiempo, y he dejado registro de lo aprendido para no repetir errores.</w:t>
+            </w:r>
+          </w:p>
+          <w:p>
+            <w:pPr>
+              <w:jc w:val="both"/>
+              <w:rPr>
+                <w:rFonts w:ascii="Calibri" w:hAnsi="Calibri"/>
               </w:rPr>
             </w:pPr>
           </w:p>
@@ -483,22 +497,15 @@
               <w:jc w:val="both"/>
               <w:rPr>
                 <w:rFonts w:ascii="Calibri" w:hAnsi="Calibri"/>
-                <w:b/>
-                <w:bCs/>
                 <w:color w:val="1F4E79" w:themeColor="accent1" w:themeShade="80"/>
               </w:rPr>
             </w:pPr>
-          </w:p>
-          <w:p>
-            <w:pPr>
-              <w:jc w:val="both"/>
+            <w:r>
               <w:rPr>
                 <w:rFonts w:ascii="Calibri" w:hAnsi="Calibri"/>
-                <w:b/>
-                <w:bCs/>
-                <w:color w:val="1F4E79" w:themeColor="accent1" w:themeShade="80"/>
               </w:rPr>
-            </w:pPr>
+              <w:t>Frente a los cambios de rumbo, los comunico rápido al equipo y los presento en la reunión semanal para que queden acordados y por escrito. Frente a las esperas de información del cliente, seguiré el plan alternativo que ya definimos: avisar a tiempo, avanzar con una alternativa y pedir apoyo si el atraso se prolonga. De ahora en adelante, voy a priorizar las tareas según su importancia y a pedir ayuda apenas note que me atraso, sin esperar a que el problema crezca.</w:t>
+            </w:r>
           </w:p>
         </w:tc>
       </w:tr>
@@ -512,78 +519,6 @@
           <w:sz w:val="24"/>
           <w:szCs w:val="24"/>
           <w:lang w:eastAsia="ja-JP"/>
-        </w:rPr>
-      </w:pPr>
-    </w:p>
-    <w:p>
-      <w:pPr>
-        <w:spacing w:after="0" w:line="360" w:lineRule="auto"/>
-        <w:jc w:val="both"/>
-        <w:rPr>
-          <w:b/>
-          <w:bCs/>
-          <w:sz w:val="24"/>
-          <w:szCs w:val="24"/>
-        </w:rPr>
-      </w:pPr>
-    </w:p>
-    <w:p>
-      <w:pPr>
-        <w:spacing w:after="0" w:line="360" w:lineRule="auto"/>
-        <w:jc w:val="both"/>
-        <w:rPr>
-          <w:b/>
-          <w:bCs/>
-          <w:sz w:val="24"/>
-          <w:szCs w:val="24"/>
-        </w:rPr>
-      </w:pPr>
-    </w:p>
-    <w:p>
-      <w:pPr>
-        <w:spacing w:after="0" w:line="360" w:lineRule="auto"/>
-        <w:jc w:val="both"/>
-        <w:rPr>
-          <w:b/>
-          <w:bCs/>
-          <w:sz w:val="24"/>
-          <w:szCs w:val="24"/>
-        </w:rPr>
-      </w:pPr>
-    </w:p>
-    <w:p>
-      <w:pPr>
-        <w:spacing w:after="0" w:line="360" w:lineRule="auto"/>
-        <w:jc w:val="both"/>
-        <w:rPr>
-          <w:b/>
-          <w:bCs/>
-          <w:sz w:val="24"/>
-          <w:szCs w:val="24"/>
-        </w:rPr>
-      </w:pPr>
-    </w:p>
-    <w:p>
-      <w:pPr>
-        <w:spacing w:after="0" w:line="360" w:lineRule="auto"/>
-        <w:jc w:val="both"/>
-        <w:rPr>
-          <w:b/>
-          <w:bCs/>
-          <w:sz w:val="24"/>
-          <w:szCs w:val="24"/>
-        </w:rPr>
-      </w:pPr>
-    </w:p>
-    <w:p>
-      <w:pPr>
-        <w:spacing w:after="0" w:line="360" w:lineRule="auto"/>
-        <w:jc w:val="both"/>
-        <w:rPr>
-          <w:b/>
-          <w:bCs/>
-          <w:sz w:val="24"/>
-          <w:szCs w:val="24"/>
         </w:rPr>
       </w:pPr>
     </w:p>
@@ -685,7 +620,6 @@
                 <w:sz w:val="24"/>
                 <w:szCs w:val="24"/>
               </w:rPr>
-              <w:lastRenderedPageBreak/>
               <w:t>¿Cómo evalúas tu</w:t>
             </w:r>
             <w:r>
@@ -737,9 +671,32 @@
               <w:jc w:val="both"/>
               <w:rPr>
                 <w:rFonts w:ascii="Calibri" w:hAnsi="Calibri"/>
-                <w:b/>
-                <w:bCs/>
-                <w:color w:val="1F4E79" w:themeColor="accent1" w:themeShade="80"/>
+              </w:rPr>
+            </w:pPr>
+            <w:r>
+              <w:rPr>
+                <w:rFonts w:ascii="Calibri" w:hAnsi="Calibri"/>
+              </w:rPr>
+              <w:t>Evalúo mi trabajo como bueno</w:t>
+            </w:r>
+            <w:r>
+              <w:rPr>
+                <w:rFonts w:ascii="Calibri" w:hAnsi="Calibri"/>
+              </w:rPr>
+              <w:t>. H</w:t>
+            </w:r>
+            <w:r>
+              <w:rPr>
+                <w:rFonts w:ascii="Calibri" w:hAnsi="Calibri"/>
+              </w:rPr>
+              <w:t>e avanzado de forma constante y he sacado adelante la parte más importante de mi responsabilidad. Destaco mi dedicación para revisar las cosas con cuidado y comprobar que realmente funcionen, y el orden con que dejo documentado lo que hago para que mis compañeros puedan retomarlo.</w:t>
+            </w:r>
+          </w:p>
+          <w:p>
+            <w:pPr>
+              <w:jc w:val="both"/>
+              <w:rPr>
+                <w:rFonts w:ascii="Calibri" w:hAnsi="Calibri"/>
               </w:rPr>
             </w:pPr>
           </w:p>
@@ -753,17 +710,12 @@
                 <w:color w:val="1F4E79" w:themeColor="accent1" w:themeShade="80"/>
               </w:rPr>
             </w:pPr>
-          </w:p>
-          <w:p>
-            <w:pPr>
-              <w:jc w:val="both"/>
+            <w:r>
               <w:rPr>
                 <w:rFonts w:ascii="Calibri" w:hAnsi="Calibri"/>
-                <w:b/>
-                <w:bCs/>
-                <w:color w:val="1F4E79" w:themeColor="accent1" w:themeShade="80"/>
               </w:rPr>
-            </w:pPr>
+              <w:t>Puedo mejorar en cerrar antes los pendientes pequeños para que no se acumulen. También en avisar más pronto al equipo cuando hay un cambio que los afecta, y en consultar antes al cliente cuando cambia lo que se espera del proyecto</w:t>
+            </w:r>
           </w:p>
         </w:tc>
       </w:tr>
@@ -874,9 +826,20 @@
               <w:jc w:val="both"/>
               <w:rPr>
                 <w:rFonts w:ascii="Calibri" w:hAnsi="Calibri"/>
-                <w:b/>
-                <w:bCs/>
-                <w:color w:val="1F4E79" w:themeColor="accent1" w:themeShade="80"/>
+              </w:rPr>
+            </w:pPr>
+            <w:r>
+              <w:rPr>
+                <w:rFonts w:ascii="Calibri" w:hAnsi="Calibri"/>
+              </w:rPr>
+              <w:t>Me queda la inquietud de cómo dejar bien formalizado el cambio de rumbo del proyecto, y de si llegaré a la próxima evaluación con todo lo necesario si el cliente se demora en entregar su información.</w:t>
+            </w:r>
+          </w:p>
+          <w:p>
+            <w:pPr>
+              <w:jc w:val="both"/>
+              <w:rPr>
+                <w:rFonts w:ascii="Calibri" w:hAnsi="Calibri"/>
               </w:rPr>
             </w:pPr>
           </w:p>
@@ -890,28 +853,12 @@
                 <w:color w:val="1F4E79" w:themeColor="accent1" w:themeShade="80"/>
               </w:rPr>
             </w:pPr>
-          </w:p>
-          <w:p>
-            <w:pPr>
-              <w:jc w:val="both"/>
+            <w:r>
               <w:rPr>
                 <w:rFonts w:ascii="Calibri" w:hAnsi="Calibri"/>
-                <w:b/>
-                <w:bCs/>
-                <w:color w:val="1F4E79" w:themeColor="accent1" w:themeShade="80"/>
               </w:rPr>
-            </w:pPr>
-          </w:p>
-          <w:p>
-            <w:pPr>
-              <w:jc w:val="both"/>
-              <w:rPr>
-                <w:rFonts w:ascii="Calibri" w:hAnsi="Calibri"/>
-                <w:b/>
-                <w:bCs/>
-                <w:color w:val="1F4E79" w:themeColor="accent1" w:themeShade="80"/>
-              </w:rPr>
-            </w:pPr>
+              <w:t>A mi docente le preguntaría cómo se evalúa un cambio de alcance que ocurre después de la primera fase, y qué se espera que mostremos en la próxima evaluación si aún faltan datos del cliente. A mis pares les preguntaría cómo han manejado ellos los atrasos que dependen de terceros.</w:t>
+            </w:r>
           </w:p>
         </w:tc>
       </w:tr>
@@ -1033,7 +980,24 @@
               <w:jc w:val="both"/>
               <w:rPr>
                 <w:rFonts w:eastAsiaTheme="majorEastAsia"/>
-                <w:color w:val="767171" w:themeColor="background2" w:themeShade="80"/>
+                <w:sz w:val="24"/>
+                <w:szCs w:val="24"/>
+              </w:rPr>
+            </w:pPr>
+            <w:r>
+              <w:rPr>
+                <w:rFonts w:eastAsiaTheme="majorEastAsia"/>
+                <w:sz w:val="24"/>
+                <w:szCs w:val="24"/>
+              </w:rPr>
+              <w:t>Consideramos que no es necesaria una redistribución grande, porque los roles están claros y son complementarios. Sí vemos útil hacer pequeños ajustes de apoyo entre nosotros. Quien se encarga de la calidad puede sumar la revisión de lo que va saliendo del resto. Quien trabaja en la parte visual puede ayudar a pulir lo que ve el usuario.</w:t>
+            </w:r>
+          </w:p>
+          <w:p>
+            <w:pPr>
+              <w:jc w:val="both"/>
+              <w:rPr>
+                <w:rFonts w:eastAsiaTheme="majorEastAsia"/>
                 <w:sz w:val="24"/>
                 <w:szCs w:val="24"/>
               </w:rPr>
@@ -1049,21 +1013,30 @@
                 <w:szCs w:val="24"/>
               </w:rPr>
             </w:pPr>
-          </w:p>
-          <w:p>
-            <w:pPr>
-              <w:jc w:val="both"/>
+            <w:r>
               <w:rPr>
-                <w:rFonts w:ascii="Calibri" w:hAnsi="Calibri"/>
-                <w:b/>
-                <w:bCs/>
-                <w:color w:val="1F4E79" w:themeColor="accent1" w:themeShade="80"/>
+                <w:rFonts w:eastAsiaTheme="majorEastAsia"/>
+                <w:sz w:val="24"/>
+                <w:szCs w:val="24"/>
               </w:rPr>
-            </w:pPr>
+              <w:t>Sí hay nuevas actividades por asignar. Yo me haré cargo de ordenar y corregir la información ya guardada y de adaptar mi trabajo al nuevo rumbo del proyecto. Además, necesitamos que el líder técnico defina quién decide sobre los pendientes que afectan a todo el equipo.</w:t>
+            </w:r>
           </w:p>
         </w:tc>
       </w:tr>
     </w:tbl>
+    <w:p>
+      <w:pPr>
+        <w:spacing w:after="0" w:line="360" w:lineRule="auto"/>
+        <w:jc w:val="both"/>
+        <w:rPr>
+          <w:color w:val="595959" w:themeColor="text1" w:themeTint="A6"/>
+          <w:sz w:val="24"/>
+          <w:szCs w:val="24"/>
+          <w:lang w:eastAsia="ja-JP"/>
+        </w:rPr>
+      </w:pPr>
+    </w:p>
     <w:p>
       <w:pPr>
         <w:spacing w:after="0" w:line="360" w:lineRule="auto"/>
@@ -1131,6 +1104,7 @@
                 <w:sz w:val="24"/>
                 <w:szCs w:val="24"/>
               </w:rPr>
+              <w:lastRenderedPageBreak/>
               <w:t>6</w:t>
             </w:r>
             <w:r>
@@ -1141,8 +1115,6 @@
               </w:rPr>
               <w:t>. APT  grupal</w:t>
             </w:r>
-            <w:bookmarkStart w:id="0" w:name="_GoBack"/>
-            <w:bookmarkEnd w:id="0"/>
           </w:p>
         </w:tc>
       </w:tr>
@@ -1191,7 +1163,56 @@
               <w:jc w:val="both"/>
               <w:rPr>
                 <w:rFonts w:eastAsiaTheme="majorEastAsia"/>
-                <w:color w:val="767171" w:themeColor="background2" w:themeShade="80"/>
+                <w:sz w:val="24"/>
+                <w:szCs w:val="24"/>
+              </w:rPr>
+            </w:pPr>
+            <w:r>
+              <w:rPr>
+                <w:rFonts w:eastAsiaTheme="majorEastAsia"/>
+                <w:sz w:val="24"/>
+                <w:szCs w:val="24"/>
+              </w:rPr>
+              <w:t>Evalú</w:t>
+            </w:r>
+            <w:r>
+              <w:rPr>
+                <w:rFonts w:eastAsiaTheme="majorEastAsia"/>
+                <w:sz w:val="24"/>
+                <w:szCs w:val="24"/>
+              </w:rPr>
+              <w:t>o</w:t>
+            </w:r>
+            <w:r>
+              <w:rPr>
+                <w:rFonts w:eastAsiaTheme="majorEastAsia"/>
+                <w:sz w:val="24"/>
+                <w:szCs w:val="24"/>
+              </w:rPr>
+              <w:t xml:space="preserve"> el trabajo en grupo de forma positiva. Desta</w:t>
+            </w:r>
+            <w:r>
+              <w:rPr>
+                <w:rFonts w:eastAsiaTheme="majorEastAsia"/>
+                <w:sz w:val="24"/>
+                <w:szCs w:val="24"/>
+              </w:rPr>
+              <w:t>co</w:t>
+            </w:r>
+            <w:r>
+              <w:rPr>
+                <w:rFonts w:eastAsiaTheme="majorEastAsia"/>
+                <w:sz w:val="24"/>
+                <w:szCs w:val="24"/>
+              </w:rPr>
+              <w:t xml:space="preserve"> que cada integrante tiene un rol claro, que nos reunimos cada semana y que mantenemos un tablero compartido donde todos vemos el avance. También destacamos que cada uno deja documentado lo que hace.</w:t>
+            </w:r>
+          </w:p>
+          <w:p>
+            <w:pPr>
+              <w:jc w:val="both"/>
+              <w:rPr>
+                <w:rFonts w:eastAsiaTheme="majorEastAsia"/>
                 <w:sz w:val="24"/>
                 <w:szCs w:val="24"/>
               </w:rPr>
@@ -1202,33 +1223,18 @@
               <w:jc w:val="both"/>
               <w:rPr>
                 <w:rFonts w:eastAsiaTheme="majorEastAsia"/>
-                <w:color w:val="767171" w:themeColor="background2" w:themeShade="80"/>
                 <w:sz w:val="24"/>
                 <w:szCs w:val="24"/>
               </w:rPr>
             </w:pPr>
-          </w:p>
-          <w:p>
-            <w:pPr>
-              <w:jc w:val="both"/>
+            <w:r>
               <w:rPr>
                 <w:rFonts w:eastAsiaTheme="majorEastAsia"/>
-                <w:color w:val="767171" w:themeColor="background2" w:themeShade="80"/>
                 <w:sz w:val="24"/>
                 <w:szCs w:val="24"/>
               </w:rPr>
-            </w:pPr>
-          </w:p>
-          <w:p>
-            <w:pPr>
-              <w:jc w:val="both"/>
-              <w:rPr>
-                <w:rFonts w:ascii="Calibri" w:hAnsi="Calibri"/>
-                <w:b/>
-                <w:bCs/>
-                <w:color w:val="1F4E79" w:themeColor="accent1" w:themeShade="80"/>
-              </w:rPr>
-            </w:pPr>
+              <w:t>Podemos mejorar en la comunicación inmediata cuando un cambio afecta a todos, en revisar juntos las decisiones importantes y en repartir mejor la carga cuando se acerca una evaluación.</w:t>
+            </w:r>
           </w:p>
         </w:tc>
       </w:tr>
@@ -1272,7 +1278,7 @@
 </file>
 
 <file path=word/endnotes.xml><?xml version="1.0" encoding="utf-8"?>
-<w:endnotes xmlns:wpc="http://schemas.microsoft.com/office/word/2010/wordprocessingCanvas" xmlns:cx="http://schemas.microsoft.com/office/drawing/2014/chartex" xmlns:mc="http://schemas.openxmlformats.org/markup-compatibility/2006" xmlns:o="urn:schemas-microsoft-com:office:office" xmlns:r="http://schemas.openxmlformats.org/officeDocument/2006/relationships" xmlns:m="http://schemas.openxmlformats.org/officeDocument/2006/math" xmlns:v="urn:schemas-microsoft-com:vml" xmlns:wp14="http://schemas.microsoft.com/office/word/2010/wordprocessingDrawing" xmlns:wp="http://schemas.openxmlformats.org/drawingml/2006/wordprocessingDrawing" xmlns:w10="urn:schemas-microsoft-com:office:word" xmlns:w="http://schemas.openxmlformats.org/wordprocessingml/2006/main" xmlns:w14="http://schemas.microsoft.com/office/word/2010/wordml" xmlns:w15="http://schemas.microsoft.com/office/word/2012/wordml" xmlns:w16se="http://schemas.microsoft.com/office/word/2015/wordml/symex" xmlns:wpg="http://schemas.microsoft.com/office/word/2010/wordprocessingGroup" xmlns:wpi="http://schemas.microsoft.com/office/word/2010/wordprocessingInk" xmlns:wne="http://schemas.microsoft.com/office/word/2006/wordml" xmlns:wps="http://schemas.microsoft.com/office/word/2010/wordprocessingShape" mc:Ignorable="w14 w15 w16se wp14">
+<w:endnotes xmlns:wpc="http://schemas.microsoft.com/office/word/2010/wordprocessingCanvas" xmlns:cx="http://schemas.microsoft.com/office/drawing/2014/chartex" xmlns:cx1="http://schemas.microsoft.com/office/drawing/2015/9/8/chartex" xmlns:cx2="http://schemas.microsoft.com/office/drawing/2015/10/21/chartex" xmlns:cx3="http://schemas.microsoft.com/office/drawing/2016/5/9/chartex" xmlns:cx4="http://schemas.microsoft.com/office/drawing/2016/5/10/chartex" xmlns:cx5="http://schemas.microsoft.com/office/drawing/2016/5/11/chartex" xmlns:cx6="http://schemas.microsoft.com/office/drawing/2016/5/12/chartex" xmlns:cx7="http://schemas.microsoft.com/office/drawing/2016/5/13/chartex" xmlns:cx8="http://schemas.microsoft.com/office/drawing/2016/5/14/chartex" xmlns:mc="http://schemas.openxmlformats.org/markup-compatibility/2006" xmlns:aink="http://schemas.microsoft.com/office/drawing/2016/ink" xmlns:am3d="http://schemas.microsoft.com/office/drawing/2017/model3d" xmlns:o="urn:schemas-microsoft-com:office:office" xmlns:oel="http://schemas.microsoft.com/office/2019/extlst" xmlns:r="http://schemas.openxmlformats.org/officeDocument/2006/relationships" xmlns:m="http://schemas.openxmlformats.org/officeDocument/2006/math" xmlns:v="urn:schemas-microsoft-com:vml" xmlns:wp14="http://schemas.microsoft.com/office/word/2010/wordprocessingDrawing" xmlns:wp="http://schemas.openxmlformats.org/drawingml/2006/wordprocessingDrawing" xmlns:w10="urn:schemas-microsoft-com:office:word" xmlns:w="http://schemas.openxmlformats.org/wordprocessingml/2006/main" xmlns:w14="http://schemas.microsoft.com/office/word/2010/wordml" xmlns:w15="http://schemas.microsoft.com/office/word/2012/wordml" xmlns:w16cex="http://schemas.microsoft.com/office/word/2018/wordml/cex" xmlns:w16cid="http://schemas.microsoft.com/office/word/2016/wordml/cid" xmlns:w16="http://schemas.microsoft.com/office/word/2018/wordml" xmlns:w16du="http://schemas.microsoft.com/office/word/2023/wordml/word16du" xmlns:w16sdtdh="http://schemas.microsoft.com/office/word/2020/wordml/sdtdatahash" xmlns:w16sdtfl="http://schemas.microsoft.com/office/word/2024/wordml/sdtformatlock" xmlns:w16se="http://schemas.microsoft.com/office/word/2015/wordml/symex" xmlns:wpg="http://schemas.microsoft.com/office/word/2010/wordprocessingGroup" xmlns:wpi="http://schemas.microsoft.com/office/word/2010/wordprocessingInk" xmlns:wne="http://schemas.microsoft.com/office/word/2006/wordml" xmlns:wps="http://schemas.microsoft.com/office/word/2010/wordprocessingShape" mc:Ignorable="w14 w15 w16se w16cid w16 w16cex w16sdtdh w16sdtfl w16du wp14">
   <w:endnote w:type="separator" w:id="-1">
     <w:p>
       <w:pPr>
@@ -1297,7 +1303,7 @@
 </file>
 
 <file path=word/footer1.xml><?xml version="1.0" encoding="utf-8"?>
-<w:ftr xmlns:wpc="http://schemas.microsoft.com/office/word/2010/wordprocessingCanvas" xmlns:cx="http://schemas.microsoft.com/office/drawing/2014/chartex" xmlns:mc="http://schemas.openxmlformats.org/markup-compatibility/2006" xmlns:o="urn:schemas-microsoft-com:office:office" xmlns:r="http://schemas.openxmlformats.org/officeDocument/2006/relationships" xmlns:m="http://schemas.openxmlformats.org/officeDocument/2006/math" xmlns:v="urn:schemas-microsoft-com:vml" xmlns:wp14="http://schemas.microsoft.com/office/word/2010/wordprocessingDrawing" xmlns:wp="http://schemas.openxmlformats.org/drawingml/2006/wordprocessingDrawing" xmlns:w10="urn:schemas-microsoft-com:office:word" xmlns:w="http://schemas.openxmlformats.org/wordprocessingml/2006/main" xmlns:w14="http://schemas.microsoft.com/office/word/2010/wordml" xmlns:w15="http://schemas.microsoft.com/office/word/2012/wordml" xmlns:w16se="http://schemas.microsoft.com/office/word/2015/wordml/symex" xmlns:wpg="http://schemas.microsoft.com/office/word/2010/wordprocessingGroup" xmlns:wpi="http://schemas.microsoft.com/office/word/2010/wordprocessingInk" xmlns:wne="http://schemas.microsoft.com/office/word/2006/wordml" xmlns:wps="http://schemas.microsoft.com/office/word/2010/wordprocessingShape" mc:Ignorable="w14 w15 w16se wp14">
+<w:ftr xmlns:wpc="http://schemas.microsoft.com/office/word/2010/wordprocessingCanvas" xmlns:cx="http://schemas.microsoft.com/office/drawing/2014/chartex" xmlns:cx1="http://schemas.microsoft.com/office/drawing/2015/9/8/chartex" xmlns:cx2="http://schemas.microsoft.com/office/drawing/2015/10/21/chartex" xmlns:cx3="http://schemas.microsoft.com/office/drawing/2016/5/9/chartex" xmlns:cx4="http://schemas.microsoft.com/office/drawing/2016/5/10/chartex" xmlns:cx5="http://schemas.microsoft.com/office/drawing/2016/5/11/chartex" xmlns:cx6="http://schemas.microsoft.com/office/drawing/2016/5/12/chartex" xmlns:cx7="http://schemas.microsoft.com/office/drawing/2016/5/13/chartex" xmlns:cx8="http://schemas.microsoft.com/office/drawing/2016/5/14/chartex" xmlns:mc="http://schemas.openxmlformats.org/markup-compatibility/2006" xmlns:aink="http://schemas.microsoft.com/office/drawing/2016/ink" xmlns:am3d="http://schemas.microsoft.com/office/drawing/2017/model3d" xmlns:o="urn:schemas-microsoft-com:office:office" xmlns:oel="http://schemas.microsoft.com/office/2019/extlst" xmlns:r="http://schemas.openxmlformats.org/officeDocument/2006/relationships" xmlns:m="http://schemas.openxmlformats.org/officeDocument/2006/math" xmlns:v="urn:schemas-microsoft-com:vml" xmlns:wp14="http://schemas.microsoft.com/office/word/2010/wordprocessingDrawing" xmlns:wp="http://schemas.openxmlformats.org/drawingml/2006/wordprocessingDrawing" xmlns:w10="urn:schemas-microsoft-com:office:word" xmlns:w="http://schemas.openxmlformats.org/wordprocessingml/2006/main" xmlns:w14="http://schemas.microsoft.com/office/word/2010/wordml" xmlns:w15="http://schemas.microsoft.com/office/word/2012/wordml" xmlns:w16cex="http://schemas.microsoft.com/office/word/2018/wordml/cex" xmlns:w16cid="http://schemas.microsoft.com/office/word/2016/wordml/cid" xmlns:w16="http://schemas.microsoft.com/office/word/2018/wordml" xmlns:w16du="http://schemas.microsoft.com/office/word/2023/wordml/word16du" xmlns:w16sdtdh="http://schemas.microsoft.com/office/word/2020/wordml/sdtdatahash" xmlns:w16sdtfl="http://schemas.microsoft.com/office/word/2024/wordml/sdtformatlock" xmlns:w16se="http://schemas.microsoft.com/office/word/2015/wordml/symex" xmlns:wpg="http://schemas.microsoft.com/office/word/2010/wordprocessingGroup" xmlns:wpi="http://schemas.microsoft.com/office/word/2010/wordprocessingInk" xmlns:wne="http://schemas.microsoft.com/office/word/2006/wordml" xmlns:wps="http://schemas.microsoft.com/office/word/2010/wordprocessingShape" mc:Ignorable="w14 w15 w16se w16cid w16 w16cex w16sdtdh w16sdtfl w16du wp14">
   <w:sdt>
     <w:sdtPr>
       <w:id w:val="-937982979"/>
@@ -1306,7 +1312,6 @@
         <w:docPartUnique/>
       </w:docPartObj>
     </w:sdtPr>
-    <w:sdtEndPr/>
     <w:sdtContent>
       <w:p>
         <w:pPr>
@@ -1585,7 +1590,7 @@
 </file>
 
 <file path=word/footnotes.xml><?xml version="1.0" encoding="utf-8"?>
-<w:footnotes xmlns:wpc="http://schemas.microsoft.com/office/word/2010/wordprocessingCanvas" xmlns:cx="http://schemas.microsoft.com/office/drawing/2014/chartex" xmlns:mc="http://schemas.openxmlformats.org/markup-compatibility/2006" xmlns:o="urn:schemas-microsoft-com:office:office" xmlns:r="http://schemas.openxmlformats.org/officeDocument/2006/relationships" xmlns:m="http://schemas.openxmlformats.org/officeDocument/2006/math" xmlns:v="urn:schemas-microsoft-com:vml" xmlns:wp14="http://schemas.microsoft.com/office/word/2010/wordprocessingDrawing" xmlns:wp="http://schemas.openxmlformats.org/drawingml/2006/wordprocessingDrawing" xmlns:w10="urn:schemas-microsoft-com:office:word" xmlns:w="http://schemas.openxmlformats.org/wordprocessingml/2006/main" xmlns:w14="http://schemas.microsoft.com/office/word/2010/wordml" xmlns:w15="http://schemas.microsoft.com/office/word/2012/wordml" xmlns:w16se="http://schemas.microsoft.com/office/word/2015/wordml/symex" xmlns:wpg="http://schemas.microsoft.com/office/word/2010/wordprocessingGroup" xmlns:wpi="http://schemas.microsoft.com/office/word/2010/wordprocessingInk" xmlns:wne="http://schemas.microsoft.com/office/word/2006/wordml" xmlns:wps="http://schemas.microsoft.com/office/word/2010/wordprocessingShape" mc:Ignorable="w14 w15 w16se wp14">
+<w:footnotes xmlns:wpc="http://schemas.microsoft.com/office/word/2010/wordprocessingCanvas" xmlns:cx="http://schemas.microsoft.com/office/drawing/2014/chartex" xmlns:cx1="http://schemas.microsoft.com/office/drawing/2015/9/8/chartex" xmlns:cx2="http://schemas.microsoft.com/office/drawing/2015/10/21/chartex" xmlns:cx3="http://schemas.microsoft.com/office/drawing/2016/5/9/chartex" xmlns:cx4="http://schemas.microsoft.com/office/drawing/2016/5/10/chartex" xmlns:cx5="http://schemas.microsoft.com/office/drawing/2016/5/11/chartex" xmlns:cx6="http://schemas.microsoft.com/office/drawing/2016/5/12/chartex" xmlns:cx7="http://schemas.microsoft.com/office/drawing/2016/5/13/chartex" xmlns:cx8="http://schemas.microsoft.com/office/drawing/2016/5/14/chartex" xmlns:mc="http://schemas.openxmlformats.org/markup-compatibility/2006" xmlns:aink="http://schemas.microsoft.com/office/drawing/2016/ink" xmlns:am3d="http://schemas.microsoft.com/office/drawing/2017/model3d" xmlns:o="urn:schemas-microsoft-com:office:office" xmlns:oel="http://schemas.microsoft.com/office/2019/extlst" xmlns:r="http://schemas.openxmlformats.org/officeDocument/2006/relationships" xmlns:m="http://schemas.openxmlformats.org/officeDocument/2006/math" xmlns:v="urn:schemas-microsoft-com:vml" xmlns:wp14="http://schemas.microsoft.com/office/word/2010/wordprocessingDrawing" xmlns:wp="http://schemas.openxmlformats.org/drawingml/2006/wordprocessingDrawing" xmlns:w10="urn:schemas-microsoft-com:office:word" xmlns:w="http://schemas.openxmlformats.org/wordprocessingml/2006/main" xmlns:w14="http://schemas.microsoft.com/office/word/2010/wordml" xmlns:w15="http://schemas.microsoft.com/office/word/2012/wordml" xmlns:w16cex="http://schemas.microsoft.com/office/word/2018/wordml/cex" xmlns:w16cid="http://schemas.microsoft.com/office/word/2016/wordml/cid" xmlns:w16="http://schemas.microsoft.com/office/word/2018/wordml" xmlns:w16du="http://schemas.microsoft.com/office/word/2023/wordml/word16du" xmlns:w16sdtdh="http://schemas.microsoft.com/office/word/2020/wordml/sdtdatahash" xmlns:w16sdtfl="http://schemas.microsoft.com/office/word/2024/wordml/sdtformatlock" xmlns:w16se="http://schemas.microsoft.com/office/word/2015/wordml/symex" xmlns:wpg="http://schemas.microsoft.com/office/word/2010/wordprocessingGroup" xmlns:wpi="http://schemas.microsoft.com/office/word/2010/wordprocessingInk" xmlns:wne="http://schemas.microsoft.com/office/word/2006/wordml" xmlns:wps="http://schemas.microsoft.com/office/word/2010/wordprocessingShape" mc:Ignorable="w14 w15 w16se w16cid w16 w16cex w16sdtdh w16sdtfl w16du wp14">
   <w:footnote w:type="separator" w:id="-1">
     <w:p>
       <w:pPr>
@@ -1610,7 +1615,7 @@
 </file>
 
 <file path=word/header1.xml><?xml version="1.0" encoding="utf-8"?>
-<w:hdr xmlns:wpc="http://schemas.microsoft.com/office/word/2010/wordprocessingCanvas" xmlns:cx="http://schemas.microsoft.com/office/drawing/2014/chartex" xmlns:mc="http://schemas.openxmlformats.org/markup-compatibility/2006" xmlns:o="urn:schemas-microsoft-com:office:office" xmlns:r="http://schemas.openxmlformats.org/officeDocument/2006/relationships" xmlns:m="http://schemas.openxmlformats.org/officeDocument/2006/math" xmlns:v="urn:schemas-microsoft-com:vml" xmlns:wp14="http://schemas.microsoft.com/office/word/2010/wordprocessingDrawing" xmlns:wp="http://schemas.openxmlformats.org/drawingml/2006/wordprocessingDrawing" xmlns:w10="urn:schemas-microsoft-com:office:word" xmlns:w="http://schemas.openxmlformats.org/wordprocessingml/2006/main" xmlns:w14="http://schemas.microsoft.com/office/word/2010/wordml" xmlns:w15="http://schemas.microsoft.com/office/word/2012/wordml" xmlns:w16se="http://schemas.microsoft.com/office/word/2015/wordml/symex" xmlns:wpg="http://schemas.microsoft.com/office/word/2010/wordprocessingGroup" xmlns:wpi="http://schemas.microsoft.com/office/word/2010/wordprocessingInk" xmlns:wne="http://schemas.microsoft.com/office/word/2006/wordml" xmlns:wps="http://schemas.microsoft.com/office/word/2010/wordprocessingShape" mc:Ignorable="w14 w15 w16se wp14">
+<w:hdr xmlns:wpc="http://schemas.microsoft.com/office/word/2010/wordprocessingCanvas" xmlns:cx="http://schemas.microsoft.com/office/drawing/2014/chartex" xmlns:cx1="http://schemas.microsoft.com/office/drawing/2015/9/8/chartex" xmlns:cx2="http://schemas.microsoft.com/office/drawing/2015/10/21/chartex" xmlns:cx3="http://schemas.microsoft.com/office/drawing/2016/5/9/chartex" xmlns:cx4="http://schemas.microsoft.com/office/drawing/2016/5/10/chartex" xmlns:cx5="http://schemas.microsoft.com/office/drawing/2016/5/11/chartex" xmlns:cx6="http://schemas.microsoft.com/office/drawing/2016/5/12/chartex" xmlns:cx7="http://schemas.microsoft.com/office/drawing/2016/5/13/chartex" xmlns:cx8="http://schemas.microsoft.com/office/drawing/2016/5/14/chartex" xmlns:mc="http://schemas.openxmlformats.org/markup-compatibility/2006" xmlns:aink="http://schemas.microsoft.com/office/drawing/2016/ink" xmlns:am3d="http://schemas.microsoft.com/office/drawing/2017/model3d" xmlns:o="urn:schemas-microsoft-com:office:office" xmlns:oel="http://schemas.microsoft.com/office/2019/extlst" xmlns:r="http://schemas.openxmlformats.org/officeDocument/2006/relationships" xmlns:m="http://schemas.openxmlformats.org/officeDocument/2006/math" xmlns:v="urn:schemas-microsoft-com:vml" xmlns:wp14="http://schemas.microsoft.com/office/word/2010/wordprocessingDrawing" xmlns:wp="http://schemas.openxmlformats.org/drawingml/2006/wordprocessingDrawing" xmlns:w10="urn:schemas-microsoft-com:office:word" xmlns:w="http://schemas.openxmlformats.org/wordprocessingml/2006/main" xmlns:w14="http://schemas.microsoft.com/office/word/2010/wordml" xmlns:w15="http://schemas.microsoft.com/office/word/2012/wordml" xmlns:w16cex="http://schemas.microsoft.com/office/word/2018/wordml/cex" xmlns:w16cid="http://schemas.microsoft.com/office/word/2016/wordml/cid" xmlns:w16="http://schemas.microsoft.com/office/word/2018/wordml" xmlns:w16du="http://schemas.microsoft.com/office/word/2023/wordml/word16du" xmlns:w16sdtdh="http://schemas.microsoft.com/office/word/2020/wordml/sdtdatahash" xmlns:w16sdtfl="http://schemas.microsoft.com/office/word/2024/wordml/sdtformatlock" xmlns:w16se="http://schemas.microsoft.com/office/word/2015/wordml/symex" xmlns:wpg="http://schemas.microsoft.com/office/word/2010/wordprocessingGroup" xmlns:wpi="http://schemas.microsoft.com/office/word/2010/wordprocessingInk" xmlns:wne="http://schemas.microsoft.com/office/word/2006/wordml" xmlns:wps="http://schemas.microsoft.com/office/word/2010/wordprocessingShape" mc:Ignorable="w14 w15 w16se w16cid w16 w16cex w16sdtdh w16sdtfl w16du wp14">
   <w:tbl>
     <w:tblPr>
       <w:tblStyle w:val="Tablaconcuadrcula"/>
@@ -1790,7 +1795,7 @@
 </file>
 
 <file path=word/header2.xml><?xml version="1.0" encoding="utf-8"?>
-<w:hdr xmlns:wpc="http://schemas.microsoft.com/office/word/2010/wordprocessingCanvas" xmlns:cx="http://schemas.microsoft.com/office/drawing/2014/chartex" xmlns:mc="http://schemas.openxmlformats.org/markup-compatibility/2006" xmlns:o="urn:schemas-microsoft-com:office:office" xmlns:r="http://schemas.openxmlformats.org/officeDocument/2006/relationships" xmlns:m="http://schemas.openxmlformats.org/officeDocument/2006/math" xmlns:v="urn:schemas-microsoft-com:vml" xmlns:wp14="http://schemas.microsoft.com/office/word/2010/wordprocessingDrawing" xmlns:wp="http://schemas.openxmlformats.org/drawingml/2006/wordprocessingDrawing" xmlns:w10="urn:schemas-microsoft-com:office:word" xmlns:w="http://schemas.openxmlformats.org/wordprocessingml/2006/main" xmlns:w14="http://schemas.microsoft.com/office/word/2010/wordml" xmlns:w15="http://schemas.microsoft.com/office/word/2012/wordml" xmlns:w16se="http://schemas.microsoft.com/office/word/2015/wordml/symex" xmlns:wpg="http://schemas.microsoft.com/office/word/2010/wordprocessingGroup" xmlns:wpi="http://schemas.microsoft.com/office/word/2010/wordprocessingInk" xmlns:wne="http://schemas.microsoft.com/office/word/2006/wordml" xmlns:wps="http://schemas.microsoft.com/office/word/2010/wordprocessingShape" mc:Ignorable="w14 w15 w16se wp14">
+<w:hdr xmlns:wpc="http://schemas.microsoft.com/office/word/2010/wordprocessingCanvas" xmlns:cx="http://schemas.microsoft.com/office/drawing/2014/chartex" xmlns:cx1="http://schemas.microsoft.com/office/drawing/2015/9/8/chartex" xmlns:cx2="http://schemas.microsoft.com/office/drawing/2015/10/21/chartex" xmlns:cx3="http://schemas.microsoft.com/office/drawing/2016/5/9/chartex" xmlns:cx4="http://schemas.microsoft.com/office/drawing/2016/5/10/chartex" xmlns:cx5="http://schemas.microsoft.com/office/drawing/2016/5/11/chartex" xmlns:cx6="http://schemas.microsoft.com/office/drawing/2016/5/12/chartex" xmlns:cx7="http://schemas.microsoft.com/office/drawing/2016/5/13/chartex" xmlns:cx8="http://schemas.microsoft.com/office/drawing/2016/5/14/chartex" xmlns:mc="http://schemas.openxmlformats.org/markup-compatibility/2006" xmlns:aink="http://schemas.microsoft.com/office/drawing/2016/ink" xmlns:am3d="http://schemas.microsoft.com/office/drawing/2017/model3d" xmlns:o="urn:schemas-microsoft-com:office:office" xmlns:oel="http://schemas.microsoft.com/office/2019/extlst" xmlns:r="http://schemas.openxmlformats.org/officeDocument/2006/relationships" xmlns:m="http://schemas.openxmlformats.org/officeDocument/2006/math" xmlns:v="urn:schemas-microsoft-com:vml" xmlns:wp14="http://schemas.microsoft.com/office/word/2010/wordprocessingDrawing" xmlns:wp="http://schemas.openxmlformats.org/drawingml/2006/wordprocessingDrawing" xmlns:w10="urn:schemas-microsoft-com:office:word" xmlns:w="http://schemas.openxmlformats.org/wordprocessingml/2006/main" xmlns:w14="http://schemas.microsoft.com/office/word/2010/wordml" xmlns:w15="http://schemas.microsoft.com/office/word/2012/wordml" xmlns:w16cex="http://schemas.microsoft.com/office/word/2018/wordml/cex" xmlns:w16cid="http://schemas.microsoft.com/office/word/2016/wordml/cid" xmlns:w16="http://schemas.microsoft.com/office/word/2018/wordml" xmlns:w16du="http://schemas.microsoft.com/office/word/2023/wordml/word16du" xmlns:w16sdtdh="http://schemas.microsoft.com/office/word/2020/wordml/sdtdatahash" xmlns:w16sdtfl="http://schemas.microsoft.com/office/word/2024/wordml/sdtformatlock" xmlns:w16se="http://schemas.microsoft.com/office/word/2015/wordml/symex" xmlns:wpg="http://schemas.microsoft.com/office/word/2010/wordprocessingGroup" xmlns:wpi="http://schemas.microsoft.com/office/word/2010/wordprocessingInk" xmlns:wne="http://schemas.microsoft.com/office/word/2006/wordml" xmlns:wps="http://schemas.microsoft.com/office/word/2010/wordprocessingShape" mc:Ignorable="w14 w15 w16se w16cid w16 w16cex w16sdtdh w16sdtfl w16du wp14">
   <w:tbl>
     <w:tblPr>
       <w:tblStyle w:val="Tablaconcuadrcula"/>
@@ -2065,7 +2070,7 @@
 </file>
 
 <file path=word/numbering.xml><?xml version="1.0" encoding="utf-8"?>
-<w:numbering xmlns:wpc="http://schemas.microsoft.com/office/word/2010/wordprocessingCanvas" xmlns:cx="http://schemas.microsoft.com/office/drawing/2014/chartex" xmlns:mc="http://schemas.openxmlformats.org/markup-compatibility/2006" xmlns:o="urn:schemas-microsoft-com:office:office" xmlns:r="http://schemas.openxmlformats.org/officeDocument/2006/relationships" xmlns:m="http://schemas.openxmlformats.org/officeDocument/2006/math" xmlns:v="urn:schemas-microsoft-com:vml" xmlns:wp14="http://schemas.microsoft.com/office/word/2010/wordprocessingDrawing" xmlns:wp="http://schemas.openxmlformats.org/drawingml/2006/wordprocessingDrawing" xmlns:w10="urn:schemas-microsoft-com:office:word" xmlns:w="http://schemas.openxmlformats.org/wordprocessingml/2006/main" xmlns:w14="http://schemas.microsoft.com/office/word/2010/wordml" xmlns:w15="http://schemas.microsoft.com/office/word/2012/wordml" xmlns:w16se="http://schemas.microsoft.com/office/word/2015/wordml/symex" xmlns:wpg="http://schemas.microsoft.com/office/word/2010/wordprocessingGroup" xmlns:wpi="http://schemas.microsoft.com/office/word/2010/wordprocessingInk" xmlns:wne="http://schemas.microsoft.com/office/word/2006/wordml" xmlns:wps="http://schemas.microsoft.com/office/word/2010/wordprocessingShape" mc:Ignorable="w14 w15 w16se wp14">
+<w:numbering xmlns:wpc="http://schemas.microsoft.com/office/word/2010/wordprocessingCanvas" xmlns:cx="http://schemas.microsoft.com/office/drawing/2014/chartex" xmlns:cx1="http://schemas.microsoft.com/office/drawing/2015/9/8/chartex" xmlns:cx2="http://schemas.microsoft.com/office/drawing/2015/10/21/chartex" xmlns:cx3="http://schemas.microsoft.com/office/drawing/2016/5/9/chartex" xmlns:cx4="http://schemas.microsoft.com/office/drawing/2016/5/10/chartex" xmlns:cx5="http://schemas.microsoft.com/office/drawing/2016/5/11/chartex" xmlns:cx6="http://schemas.microsoft.com/office/drawing/2016/5/12/chartex" xmlns:cx7="http://schemas.microsoft.com/office/drawing/2016/5/13/chartex" xmlns:cx8="http://schemas.microsoft.com/office/drawing/2016/5/14/chartex" xmlns:mc="http://schemas.openxmlformats.org/markup-compatibility/2006" xmlns:aink="http://schemas.microsoft.com/office/drawing/2016/ink" xmlns:am3d="http://schemas.microsoft.com/office/drawing/2017/model3d" xmlns:o="urn:schemas-microsoft-com:office:office" xmlns:oel="http://schemas.microsoft.com/office/2019/extlst" xmlns:r="http://schemas.openxmlformats.org/officeDocument/2006/relationships" xmlns:m="http://schemas.openxmlformats.org/officeDocument/2006/math" xmlns:v="urn:schemas-microsoft-com:vml" xmlns:wp14="http://schemas.microsoft.com/office/word/2010/wordprocessingDrawing" xmlns:wp="http://schemas.openxmlformats.org/drawingml/2006/wordprocessingDrawing" xmlns:w10="urn:schemas-microsoft-com:office:word" xmlns:w="http://schemas.openxmlformats.org/wordprocessingml/2006/main" xmlns:w14="http://schemas.microsoft.com/office/word/2010/wordml" xmlns:w15="http://schemas.microsoft.com/office/word/2012/wordml" xmlns:w16cex="http://schemas.microsoft.com/office/word/2018/wordml/cex" xmlns:w16cid="http://schemas.microsoft.com/office/word/2016/wordml/cid" xmlns:w16="http://schemas.microsoft.com/office/word/2018/wordml" xmlns:w16du="http://schemas.microsoft.com/office/word/2023/wordml/word16du" xmlns:w16sdtdh="http://schemas.microsoft.com/office/word/2020/wordml/sdtdatahash" xmlns:w16sdtfl="http://schemas.microsoft.com/office/word/2024/wordml/sdtformatlock" xmlns:w16se="http://schemas.microsoft.com/office/word/2015/wordml/symex" xmlns:wpg="http://schemas.microsoft.com/office/word/2010/wordprocessingGroup" xmlns:wpi="http://schemas.microsoft.com/office/word/2010/wordprocessingInk" xmlns:wne="http://schemas.microsoft.com/office/word/2006/wordml" xmlns:wps="http://schemas.microsoft.com/office/word/2010/wordprocessingShape" mc:Ignorable="w14 w15 w16se w16cid w16 w16cex w16sdtdh w16sdtfl w16du wp14">
   <w:abstractNum w:abstractNumId="0" w15:restartNumberingAfterBreak="0">
     <w:nsid w:val="049156A1"/>
     <w:multiLevelType w:val="hybridMultilevel"/>
@@ -6639,124 +6644,124 @@
       </w:rPr>
     </w:lvl>
   </w:abstractNum>
-  <w:num w:numId="1">
+  <w:num w:numId="1" w16cid:durableId="231156542">
     <w:abstractNumId w:val="3"/>
   </w:num>
-  <w:num w:numId="2">
+  <w:num w:numId="2" w16cid:durableId="1262881462">
     <w:abstractNumId w:val="8"/>
   </w:num>
-  <w:num w:numId="3">
+  <w:num w:numId="3" w16cid:durableId="2117551867">
     <w:abstractNumId w:val="12"/>
   </w:num>
-  <w:num w:numId="4">
+  <w:num w:numId="4" w16cid:durableId="1156074725">
     <w:abstractNumId w:val="28"/>
   </w:num>
-  <w:num w:numId="5">
+  <w:num w:numId="5" w16cid:durableId="1566452755">
     <w:abstractNumId w:val="30"/>
   </w:num>
-  <w:num w:numId="6">
+  <w:num w:numId="6" w16cid:durableId="1111784300">
     <w:abstractNumId w:val="4"/>
   </w:num>
-  <w:num w:numId="7">
+  <w:num w:numId="7" w16cid:durableId="637883804">
     <w:abstractNumId w:val="11"/>
   </w:num>
-  <w:num w:numId="8">
+  <w:num w:numId="8" w16cid:durableId="732773465">
     <w:abstractNumId w:val="19"/>
   </w:num>
-  <w:num w:numId="9">
+  <w:num w:numId="9" w16cid:durableId="1298099776">
     <w:abstractNumId w:val="15"/>
   </w:num>
-  <w:num w:numId="10">
+  <w:num w:numId="10" w16cid:durableId="194009132">
     <w:abstractNumId w:val="9"/>
   </w:num>
-  <w:num w:numId="11">
+  <w:num w:numId="11" w16cid:durableId="72823335">
     <w:abstractNumId w:val="24"/>
   </w:num>
-  <w:num w:numId="12">
+  <w:num w:numId="12" w16cid:durableId="399136129">
     <w:abstractNumId w:val="35"/>
   </w:num>
-  <w:num w:numId="13">
+  <w:num w:numId="13" w16cid:durableId="1995523031">
     <w:abstractNumId w:val="29"/>
   </w:num>
-  <w:num w:numId="14">
+  <w:num w:numId="14" w16cid:durableId="1139883163">
     <w:abstractNumId w:val="1"/>
   </w:num>
-  <w:num w:numId="15">
+  <w:num w:numId="15" w16cid:durableId="1962106905">
     <w:abstractNumId w:val="36"/>
   </w:num>
-  <w:num w:numId="16">
+  <w:num w:numId="16" w16cid:durableId="1324820439">
     <w:abstractNumId w:val="21"/>
   </w:num>
-  <w:num w:numId="17">
+  <w:num w:numId="17" w16cid:durableId="851843657">
     <w:abstractNumId w:val="17"/>
   </w:num>
-  <w:num w:numId="18">
+  <w:num w:numId="18" w16cid:durableId="20977039">
     <w:abstractNumId w:val="31"/>
   </w:num>
-  <w:num w:numId="19">
+  <w:num w:numId="19" w16cid:durableId="1334801694">
     <w:abstractNumId w:val="10"/>
   </w:num>
-  <w:num w:numId="20">
+  <w:num w:numId="20" w16cid:durableId="194469367">
     <w:abstractNumId w:val="39"/>
   </w:num>
-  <w:num w:numId="21">
+  <w:num w:numId="21" w16cid:durableId="2125034253">
     <w:abstractNumId w:val="34"/>
   </w:num>
-  <w:num w:numId="22">
+  <w:num w:numId="22" w16cid:durableId="1553662257">
     <w:abstractNumId w:val="13"/>
   </w:num>
-  <w:num w:numId="23">
+  <w:num w:numId="23" w16cid:durableId="1926725186">
     <w:abstractNumId w:val="14"/>
   </w:num>
-  <w:num w:numId="24">
+  <w:num w:numId="24" w16cid:durableId="1827740602">
     <w:abstractNumId w:val="5"/>
   </w:num>
-  <w:num w:numId="25">
+  <w:num w:numId="25" w16cid:durableId="1053889496">
     <w:abstractNumId w:val="16"/>
   </w:num>
-  <w:num w:numId="26">
+  <w:num w:numId="26" w16cid:durableId="1670868912">
     <w:abstractNumId w:val="20"/>
   </w:num>
-  <w:num w:numId="27">
+  <w:num w:numId="27" w16cid:durableId="1527057662">
     <w:abstractNumId w:val="23"/>
   </w:num>
-  <w:num w:numId="28">
+  <w:num w:numId="28" w16cid:durableId="200019290">
     <w:abstractNumId w:val="0"/>
   </w:num>
-  <w:num w:numId="29">
+  <w:num w:numId="29" w16cid:durableId="866872112">
     <w:abstractNumId w:val="18"/>
   </w:num>
-  <w:num w:numId="30">
+  <w:num w:numId="30" w16cid:durableId="1397972921">
     <w:abstractNumId w:val="22"/>
   </w:num>
-  <w:num w:numId="31">
+  <w:num w:numId="31" w16cid:durableId="1926181864">
     <w:abstractNumId w:val="2"/>
   </w:num>
-  <w:num w:numId="32">
+  <w:num w:numId="32" w16cid:durableId="1401561380">
     <w:abstractNumId w:val="7"/>
   </w:num>
-  <w:num w:numId="33">
+  <w:num w:numId="33" w16cid:durableId="1281451615">
     <w:abstractNumId w:val="32"/>
   </w:num>
-  <w:num w:numId="34">
+  <w:num w:numId="34" w16cid:durableId="1346710508">
     <w:abstractNumId w:val="38"/>
   </w:num>
-  <w:num w:numId="35">
+  <w:num w:numId="35" w16cid:durableId="1568570659">
     <w:abstractNumId w:val="6"/>
   </w:num>
-  <w:num w:numId="36">
+  <w:num w:numId="36" w16cid:durableId="1318876541">
     <w:abstractNumId w:val="25"/>
   </w:num>
-  <w:num w:numId="37">
+  <w:num w:numId="37" w16cid:durableId="1769810084">
     <w:abstractNumId w:val="37"/>
   </w:num>
-  <w:num w:numId="38">
+  <w:num w:numId="38" w16cid:durableId="1651980113">
     <w:abstractNumId w:val="27"/>
   </w:num>
-  <w:num w:numId="39">
+  <w:num w:numId="39" w16cid:durableId="1885168556">
     <w:abstractNumId w:val="26"/>
   </w:num>
-  <w:num w:numId="40">
+  <w:num w:numId="40" w16cid:durableId="229342159">
     <w:abstractNumId w:val="33"/>
   </w:num>
   <w:numIdMacAtCleanup w:val="18"/>
@@ -6764,7 +6769,7 @@
 </file>
 
 <file path=word/styles.xml><?xml version="1.0" encoding="utf-8"?>
-<w:styles xmlns:mc="http://schemas.openxmlformats.org/markup-compatibility/2006" xmlns:r="http://schemas.openxmlformats.org/officeDocument/2006/relationships" xmlns:w="http://schemas.openxmlformats.org/wordprocessingml/2006/main" xmlns:w14="http://schemas.microsoft.com/office/word/2010/wordml" xmlns:w15="http://schemas.microsoft.com/office/word/2012/wordml" xmlns:w16se="http://schemas.microsoft.com/office/word/2015/wordml/symex" mc:Ignorable="w14 w15 w16se">
+<w:styles xmlns:mc="http://schemas.openxmlformats.org/markup-compatibility/2006" xmlns:r="http://schemas.openxmlformats.org/officeDocument/2006/relationships" xmlns:w="http://schemas.openxmlformats.org/wordprocessingml/2006/main" xmlns:w14="http://schemas.microsoft.com/office/word/2010/wordml" xmlns:w15="http://schemas.microsoft.com/office/word/2012/wordml" xmlns:w16cex="http://schemas.microsoft.com/office/word/2018/wordml/cex" xmlns:w16cid="http://schemas.microsoft.com/office/word/2016/wordml/cid" xmlns:w16="http://schemas.microsoft.com/office/word/2018/wordml" xmlns:w16du="http://schemas.microsoft.com/office/word/2023/wordml/word16du" xmlns:w16sdtdh="http://schemas.microsoft.com/office/word/2020/wordml/sdtdatahash" xmlns:w16sdtfl="http://schemas.microsoft.com/office/word/2024/wordml/sdtformatlock" xmlns:w16se="http://schemas.microsoft.com/office/word/2015/wordml/symex" mc:Ignorable="w14 w15 w16se w16cid w16 w16cex w16sdtdh w16sdtfl w16du">
   <w:docDefaults>
     <w:rPrDefault>
       <w:rPr>
@@ -6780,7 +6785,7 @@
       </w:pPr>
     </w:pPrDefault>
   </w:docDefaults>
-  <w:latentStyles w:defLockedState="0" w:defUIPriority="99" w:defSemiHidden="0" w:defUnhideWhenUsed="0" w:defQFormat="0" w:count="371">
+  <w:latentStyles w:defLockedState="0" w:defUIPriority="99" w:defSemiHidden="0" w:defUnhideWhenUsed="0" w:defQFormat="0" w:count="376">
     <w:lsdException w:name="Normal" w:uiPriority="0" w:qFormat="1"/>
     <w:lsdException w:name="heading 1" w:uiPriority="9" w:qFormat="1"/>
     <w:lsdException w:name="heading 2" w:semiHidden="1" w:uiPriority="9" w:unhideWhenUsed="1" w:qFormat="1"/>
@@ -7152,6 +7157,11 @@
     <w:lsdException w:name="List Table 5 Dark Accent 6" w:uiPriority="50"/>
     <w:lsdException w:name="List Table 6 Colorful Accent 6" w:uiPriority="51"/>
     <w:lsdException w:name="List Table 7 Colorful Accent 6" w:uiPriority="52"/>
+    <w:lsdException w:name="Mention" w:semiHidden="1" w:unhideWhenUsed="1"/>
+    <w:lsdException w:name="Smart Hyperlink" w:semiHidden="1" w:unhideWhenUsed="1"/>
+    <w:lsdException w:name="Hashtag" w:semiHidden="1" w:unhideWhenUsed="1"/>
+    <w:lsdException w:name="Unresolved Mention" w:semiHidden="1" w:unhideWhenUsed="1"/>
+    <w:lsdException w:name="Smart Link" w:semiHidden="1" w:unhideWhenUsed="1"/>
   </w:latentStyles>
   <w:style w:type="paragraph" w:default="1" w:styleId="Normal">
     <w:name w:val="Normal"/>
@@ -7225,7 +7235,6 @@
   <w:style w:type="character" w:default="1" w:styleId="Fuentedeprrafopredeter">
     <w:name w:val="Default Paragraph Font"/>
     <w:uiPriority w:val="1"/>
-    <w:semiHidden/>
     <w:unhideWhenUsed/>
   </w:style>
   <w:style w:type="table" w:default="1" w:styleId="Tablanormal">
@@ -8135,7 +8144,7 @@
       <w:szCs w:val="24"/>
     </w:rPr>
   </w:style>
-  <w:style w:type="table" w:styleId="Cuadrculadetablaclara">
+  <w:style w:type="table" w:styleId="Tablaconcuadrculaclara">
     <w:name w:val="Grid Table Light"/>
     <w:basedOn w:val="Tablanormal"/>
     <w:uiPriority w:val="40"/>
@@ -8157,7 +8166,7 @@
   <w:style w:type="table" w:customStyle="1" w:styleId="Cuadrculadetablaclara1">
     <w:name w:val="Cuadrícula de tabla clara1"/>
     <w:basedOn w:val="Tablanormal"/>
-    <w:next w:val="Cuadrculadetablaclara"/>
+    <w:next w:val="Tablaconcuadrculaclara"/>
     <w:uiPriority w:val="40"/>
     <w:rsid w:val="00943DF1"/>
     <w:pPr>
@@ -8198,7 +8207,7 @@
       <w:spacing w:after="0" w:line="240" w:lineRule="auto"/>
     </w:pPr>
   </w:style>
-  <w:style w:type="character" w:styleId="Textoennegrita">
+  <w:style w:type="character" w:styleId="Fuerte">
     <w:name w:val="Strong"/>
     <w:basedOn w:val="Fuentedeprrafopredeter"/>
     <w:uiPriority w:val="22"/>
@@ -8210,532 +8219,6 @@
     </w:rPr>
   </w:style>
 </w:styles>
-</file>
-
-<file path=word/glossary/document.xml><?xml version="1.0" encoding="utf-8"?>
-<w:glossaryDocument xmlns:wpc="http://schemas.microsoft.com/office/word/2010/wordprocessingCanvas" xmlns:cx="http://schemas.microsoft.com/office/drawing/2014/chartex" xmlns:mc="http://schemas.openxmlformats.org/markup-compatibility/2006" xmlns:o="urn:schemas-microsoft-com:office:office" xmlns:r="http://schemas.openxmlformats.org/officeDocument/2006/relationships" xmlns:m="http://schemas.openxmlformats.org/officeDocument/2006/math" xmlns:v="urn:schemas-microsoft-com:vml" xmlns:wp14="http://schemas.microsoft.com/office/word/2010/wordprocessingDrawing" xmlns:wp="http://schemas.openxmlformats.org/drawingml/2006/wordprocessingDrawing" xmlns:w10="urn:schemas-microsoft-com:office:word" xmlns:w="http://schemas.openxmlformats.org/wordprocessingml/2006/main" xmlns:w14="http://schemas.microsoft.com/office/word/2010/wordml" xmlns:w15="http://schemas.microsoft.com/office/word/2012/wordml" xmlns:w16se="http://schemas.microsoft.com/office/word/2015/wordml/symex" xmlns:wpg="http://schemas.microsoft.com/office/word/2010/wordprocessingGroup" xmlns:wpi="http://schemas.microsoft.com/office/word/2010/wordprocessingInk" xmlns:wne="http://schemas.microsoft.com/office/word/2006/wordml" xmlns:wps="http://schemas.microsoft.com/office/word/2010/wordprocessingShape" mc:Ignorable="w14 w15 w16se wp14"/>
-</file>
-
-<file path=word/glossary/fontTable.xml><?xml version="1.0" encoding="utf-8"?>
-<w:fonts xmlns:mc="http://schemas.openxmlformats.org/markup-compatibility/2006" xmlns:r="http://schemas.openxmlformats.org/officeDocument/2006/relationships" xmlns:w="http://schemas.openxmlformats.org/wordprocessingml/2006/main" xmlns:w14="http://schemas.microsoft.com/office/word/2010/wordml" xmlns:w15="http://schemas.microsoft.com/office/word/2012/wordml" xmlns:w16se="http://schemas.microsoft.com/office/word/2015/wordml/symex" mc:Ignorable="w14 w15 w16se">
-  <w:font w:name="Calibri">
-    <w:panose1 w:val="020F0502020204030204"/>
-    <w:charset w:val="00"/>
-    <w:family w:val="swiss"/>
-    <w:pitch w:val="variable"/>
-    <w:sig w:usb0="E4002EFF" w:usb1="C000247B" w:usb2="00000009" w:usb3="00000000" w:csb0="000001FF" w:csb1="00000000"/>
-  </w:font>
-  <w:font w:name="Times New Roman">
-    <w:panose1 w:val="02020603050405020304"/>
-    <w:charset w:val="00"/>
-    <w:family w:val="roman"/>
-    <w:pitch w:val="variable"/>
-    <w:sig w:usb0="E0002EFF" w:usb1="C000785B" w:usb2="00000009" w:usb3="00000000" w:csb0="000001FF" w:csb1="00000000"/>
-  </w:font>
-  <w:font w:name="Courier New">
-    <w:panose1 w:val="02070309020205020404"/>
-    <w:charset w:val="00"/>
-    <w:family w:val="modern"/>
-    <w:pitch w:val="fixed"/>
-    <w:sig w:usb0="E0002EFF" w:usb1="C0007843" w:usb2="00000009" w:usb3="00000000" w:csb0="000001FF" w:csb1="00000000"/>
-  </w:font>
-  <w:font w:name="Wingdings">
-    <w:panose1 w:val="05000000000000000000"/>
-    <w:charset w:val="02"/>
-    <w:family w:val="auto"/>
-    <w:pitch w:val="variable"/>
-    <w:sig w:usb0="00000000" w:usb1="10000000" w:usb2="00000000" w:usb3="00000000" w:csb0="80000000" w:csb1="00000000"/>
-  </w:font>
-  <w:font w:name="Symbol">
-    <w:panose1 w:val="05050102010706020507"/>
-    <w:charset w:val="02"/>
-    <w:family w:val="roman"/>
-    <w:pitch w:val="variable"/>
-    <w:sig w:usb0="00000000" w:usb1="10000000" w:usb2="00000000" w:usb3="00000000" w:csb0="80000000" w:csb1="00000000"/>
-  </w:font>
-  <w:font w:name="Calibri Light">
-    <w:panose1 w:val="020F0302020204030204"/>
-    <w:charset w:val="00"/>
-    <w:family w:val="swiss"/>
-    <w:pitch w:val="variable"/>
-    <w:sig w:usb0="E4002EFF" w:usb1="C000247B" w:usb2="00000009" w:usb3="00000000" w:csb0="000001FF" w:csb1="00000000"/>
-  </w:font>
-  <w:font w:name="Segoe UI">
-    <w:panose1 w:val="020B0502040204020203"/>
-    <w:charset w:val="00"/>
-    <w:family w:val="swiss"/>
-    <w:pitch w:val="variable"/>
-    <w:sig w:usb0="E4002EFF" w:usb1="C000E47F" w:usb2="00000009" w:usb3="00000000" w:csb0="000001FF" w:csb1="00000000"/>
-  </w:font>
-  <w:font w:name="Century Gothic">
-    <w:panose1 w:val="020B0502020202020204"/>
-    <w:charset w:val="00"/>
-    <w:family w:val="swiss"/>
-    <w:pitch w:val="variable"/>
-    <w:sig w:usb0="00000287" w:usb1="00000000" w:usb2="00000000" w:usb3="00000000" w:csb0="0000009F" w:csb1="00000000"/>
-  </w:font>
-</w:fonts>
-</file>
-
-<file path=word/glossary/settings.xml><?xml version="1.0" encoding="utf-8"?>
-<w:settings xmlns:mc="http://schemas.openxmlformats.org/markup-compatibility/2006" xmlns:o="urn:schemas-microsoft-com:office:office" xmlns:r="http://schemas.openxmlformats.org/officeDocument/2006/relationships" xmlns:m="http://schemas.openxmlformats.org/officeDocument/2006/math" xmlns:v="urn:schemas-microsoft-com:vml" xmlns:w10="urn:schemas-microsoft-com:office:word" xmlns:w="http://schemas.openxmlformats.org/wordprocessingml/2006/main" xmlns:w14="http://schemas.microsoft.com/office/word/2010/wordml" xmlns:w15="http://schemas.microsoft.com/office/word/2012/wordml" xmlns:w16se="http://schemas.microsoft.com/office/word/2015/wordml/symex" xmlns:sl="http://schemas.openxmlformats.org/schemaLibrary/2006/main" mc:Ignorable="w14 w15 w16se">
-  <w:defaultTabStop w:val="708"/>
-  <w:hyphenationZone w:val="425"/>
-  <w:characterSpacingControl w:val="doNotCompress"/>
-  <w:compat>
-    <w:useFELayout/>
-    <w:compatSetting w:name="compatibilityMode" w:uri="http://schemas.microsoft.com/office/word" w:val="12"/>
-  </w:compat>
-  <w:rsids>
-    <w:rsidRoot w:val="008F14D6"/>
-    <w:rsid w:val="008F14D6"/>
-  </w:rsids>
-  <m:mathPr>
-    <m:mathFont m:val="Cambria Math"/>
-    <m:brkBin m:val="before"/>
-    <m:brkBinSub m:val="--"/>
-    <m:smallFrac m:val="0"/>
-    <m:dispDef/>
-    <m:lMargin m:val="0"/>
-    <m:rMargin m:val="0"/>
-    <m:defJc m:val="centerGroup"/>
-    <m:wrapIndent m:val="1440"/>
-    <m:intLim m:val="subSup"/>
-    <m:naryLim m:val="undOvr"/>
-  </m:mathPr>
-  <w:themeFontLang w:val="es-CL"/>
-  <w:clrSchemeMapping w:bg1="light1" w:t1="dark1" w:bg2="light2" w:t2="dark2" w:accent1="accent1" w:accent2="accent2" w:accent3="accent3" w:accent4="accent4" w:accent5="accent5" w:accent6="accent6" w:hyperlink="hyperlink" w:followedHyperlink="followedHyperlink"/>
-  <w:decimalSymbol w:val=","/>
-  <w:listSeparator w:val=";"/>
-</w:settings>
-</file>
-
-<file path=word/glossary/styles.xml><?xml version="1.0" encoding="utf-8"?>
-<w:styles xmlns:mc="http://schemas.openxmlformats.org/markup-compatibility/2006" xmlns:r="http://schemas.openxmlformats.org/officeDocument/2006/relationships" xmlns:w="http://schemas.openxmlformats.org/wordprocessingml/2006/main" xmlns:w14="http://schemas.microsoft.com/office/word/2010/wordml" xmlns:w15="http://schemas.microsoft.com/office/word/2012/wordml" xmlns:w16se="http://schemas.microsoft.com/office/word/2015/wordml/symex" mc:Ignorable="w14 w15 w16se">
-  <w:docDefaults>
-    <w:rPrDefault>
-      <w:rPr>
-        <w:rFonts w:asciiTheme="minorHAnsi" w:eastAsiaTheme="minorEastAsia" w:hAnsiTheme="minorHAnsi" w:cstheme="minorBidi"/>
-        <w:sz w:val="22"/>
-        <w:szCs w:val="22"/>
-        <w:lang w:val="es-CL" w:eastAsia="es-CL" w:bidi="ar-SA"/>
-      </w:rPr>
-    </w:rPrDefault>
-    <w:pPrDefault>
-      <w:pPr>
-        <w:spacing w:after="160" w:line="259" w:lineRule="auto"/>
-      </w:pPr>
-    </w:pPrDefault>
-  </w:docDefaults>
-  <w:latentStyles w:defLockedState="0" w:defUIPriority="99" w:defSemiHidden="0" w:defUnhideWhenUsed="0" w:defQFormat="0" w:count="371">
-    <w:lsdException w:name="Normal" w:uiPriority="0" w:qFormat="1"/>
-    <w:lsdException w:name="heading 1" w:uiPriority="9" w:qFormat="1"/>
-    <w:lsdException w:name="heading 2" w:semiHidden="1" w:uiPriority="9" w:unhideWhenUsed="1" w:qFormat="1"/>
-    <w:lsdException w:name="heading 3" w:semiHidden="1" w:uiPriority="9" w:unhideWhenUsed="1" w:qFormat="1"/>
-    <w:lsdException w:name="heading 4" w:semiHidden="1" w:uiPriority="9" w:unhideWhenUsed="1" w:qFormat="1"/>
-    <w:lsdException w:name="heading 5" w:semiHidden="1" w:uiPriority="9" w:unhideWhenUsed="1" w:qFormat="1"/>
-    <w:lsdException w:name="heading 6" w:semiHidden="1" w:uiPriority="9" w:unhideWhenUsed="1" w:qFormat="1"/>
-    <w:lsdException w:name="heading 7" w:semiHidden="1" w:uiPriority="9" w:unhideWhenUsed="1" w:qFormat="1"/>
-    <w:lsdException w:name="heading 8" w:semiHidden="1" w:uiPriority="9" w:unhideWhenUsed="1" w:qFormat="1"/>
-    <w:lsdException w:name="heading 9" w:semiHidden="1" w:uiPriority="9" w:unhideWhenUsed="1" w:qFormat="1"/>
-    <w:lsdException w:name="index 1" w:semiHidden="1" w:unhideWhenUsed="1"/>
-    <w:lsdException w:name="index 2" w:semiHidden="1" w:unhideWhenUsed="1"/>
-    <w:lsdException w:name="index 3" w:semiHidden="1" w:unhideWhenUsed="1"/>
-    <w:lsdException w:name="index 4" w:semiHidden="1" w:unhideWhenUsed="1"/>
-    <w:lsdException w:name="index 5" w:semiHidden="1" w:unhideWhenUsed="1"/>
-    <w:lsdException w:name="index 6" w:semiHidden="1" w:unhideWhenUsed="1"/>
-    <w:lsdException w:name="index 7" w:semiHidden="1" w:unhideWhenUsed="1"/>
-    <w:lsdException w:name="index 8" w:semiHidden="1" w:unhideWhenUsed="1"/>
-    <w:lsdException w:name="index 9" w:semiHidden="1" w:unhideWhenUsed="1"/>
-    <w:lsdException w:name="toc 1" w:semiHidden="1" w:uiPriority="39" w:unhideWhenUsed="1"/>
-    <w:lsdException w:name="toc 2" w:semiHidden="1" w:uiPriority="39" w:unhideWhenUsed="1"/>
-    <w:lsdException w:name="toc 3" w:semiHidden="1" w:uiPriority="39" w:unhideWhenUsed="1"/>
-    <w:lsdException w:name="toc 4" w:semiHidden="1" w:uiPriority="39" w:unhideWhenUsed="1"/>
-    <w:lsdException w:name="toc 5" w:semiHidden="1" w:uiPriority="39" w:unhideWhenUsed="1"/>
-    <w:lsdException w:name="toc 6" w:semiHidden="1" w:uiPriority="39" w:unhideWhenUsed="1"/>
-    <w:lsdException w:name="toc 7" w:semiHidden="1" w:uiPriority="39" w:unhideWhenUsed="1"/>
-    <w:lsdException w:name="toc 8" w:semiHidden="1" w:uiPriority="39" w:unhideWhenUsed="1"/>
-    <w:lsdException w:name="toc 9" w:semiHidden="1" w:uiPriority="39" w:unhideWhenUsed="1"/>
-    <w:lsdException w:name="Normal Indent" w:semiHidden="1" w:unhideWhenUsed="1"/>
-    <w:lsdException w:name="footnote text" w:semiHidden="1" w:unhideWhenUsed="1"/>
-    <w:lsdException w:name="annotation text" w:semiHidden="1" w:unhideWhenUsed="1"/>
-    <w:lsdException w:name="header" w:semiHidden="1" w:unhideWhenUsed="1"/>
-    <w:lsdException w:name="footer" w:semiHidden="1" w:unhideWhenUsed="1"/>
-    <w:lsdException w:name="index heading" w:semiHidden="1" w:unhideWhenUsed="1"/>
-    <w:lsdException w:name="caption" w:semiHidden="1" w:uiPriority="35" w:unhideWhenUsed="1" w:qFormat="1"/>
-    <w:lsdException w:name="table of figures" w:semiHidden="1" w:unhideWhenUsed="1"/>
-    <w:lsdException w:name="envelope address" w:semiHidden="1" w:unhideWhenUsed="1"/>
-    <w:lsdException w:name="envelope return" w:semiHidden="1" w:unhideWhenUsed="1"/>
-    <w:lsdException w:name="footnote reference" w:semiHidden="1" w:unhideWhenUsed="1"/>
-    <w:lsdException w:name="annotation reference" w:semiHidden="1" w:unhideWhenUsed="1"/>
-    <w:lsdException w:name="line number" w:semiHidden="1" w:unhideWhenUsed="1"/>
-    <w:lsdException w:name="page number" w:semiHidden="1" w:unhideWhenUsed="1"/>
-    <w:lsdException w:name="endnote reference" w:semiHidden="1" w:unhideWhenUsed="1"/>
-    <w:lsdException w:name="endnote text" w:semiHidden="1" w:unhideWhenUsed="1"/>
-    <w:lsdException w:name="table of authorities" w:semiHidden="1" w:unhideWhenUsed="1"/>
-    <w:lsdException w:name="macro" w:semiHidden="1" w:unhideWhenUsed="1"/>
-    <w:lsdException w:name="toa heading" w:semiHidden="1" w:unhideWhenUsed="1"/>
-    <w:lsdException w:name="List" w:semiHidden="1" w:unhideWhenUsed="1"/>
-    <w:lsdException w:name="List Bullet" w:semiHidden="1" w:unhideWhenUsed="1"/>
-    <w:lsdException w:name="List Number" w:semiHidden="1" w:unhideWhenUsed="1"/>
-    <w:lsdException w:name="List 2" w:semiHidden="1" w:unhideWhenUsed="1"/>
-    <w:lsdException w:name="List 3" w:semiHidden="1" w:unhideWhenUsed="1"/>
-    <w:lsdException w:name="List 4" w:semiHidden="1" w:unhideWhenUsed="1"/>
-    <w:lsdException w:name="List 5" w:semiHidden="1" w:unhideWhenUsed="1"/>
-    <w:lsdException w:name="List Bullet 2" w:semiHidden="1" w:unhideWhenUsed="1"/>
-    <w:lsdException w:name="List Bullet 3" w:semiHidden="1" w:unhideWhenUsed="1"/>
-    <w:lsdException w:name="List Bullet 4" w:semiHidden="1" w:unhideWhenUsed="1"/>
-    <w:lsdException w:name="List Bullet 5" w:semiHidden="1" w:unhideWhenUsed="1"/>
-    <w:lsdException w:name="List Number 2" w:semiHidden="1" w:unhideWhenUsed="1"/>
-    <w:lsdException w:name="List Number 3" w:semiHidden="1" w:unhideWhenUsed="1"/>
-    <w:lsdException w:name="List Number 4" w:semiHidden="1" w:unhideWhenUsed="1"/>
-    <w:lsdException w:name="List Number 5" w:semiHidden="1" w:unhideWhenUsed="1"/>
-    <w:lsdException w:name="Title" w:uiPriority="10" w:qFormat="1"/>
-    <w:lsdException w:name="Closing" w:semiHidden="1" w:unhideWhenUsed="1"/>
-    <w:lsdException w:name="Signature" w:semiHidden="1" w:unhideWhenUsed="1"/>
-    <w:lsdException w:name="Default Paragraph Font" w:semiHidden="1" w:uiPriority="1" w:unhideWhenUsed="1"/>
-    <w:lsdException w:name="Body Text" w:semiHidden="1" w:unhideWhenUsed="1"/>
-    <w:lsdException w:name="Body Text Indent" w:semiHidden="1" w:unhideWhenUsed="1"/>
-    <w:lsdException w:name="List Continue" w:semiHidden="1" w:unhideWhenUsed="1"/>
-    <w:lsdException w:name="List Continue 2" w:semiHidden="1" w:unhideWhenUsed="1"/>
-    <w:lsdException w:name="List Continue 3" w:semiHidden="1" w:unhideWhenUsed="1"/>
-    <w:lsdException w:name="List Continue 4" w:semiHidden="1" w:unhideWhenUsed="1"/>
-    <w:lsdException w:name="List Continue 5" w:semiHidden="1" w:unhideWhenUsed="1"/>
-    <w:lsdException w:name="Message Header" w:semiHidden="1" w:unhideWhenUsed="1"/>
-    <w:lsdException w:name="Subtitle" w:uiPriority="11" w:qFormat="1"/>
-    <w:lsdException w:name="Salutation" w:semiHidden="1" w:unhideWhenUsed="1"/>
-    <w:lsdException w:name="Date" w:semiHidden="1" w:unhideWhenUsed="1"/>
-    <w:lsdException w:name="Body Text First Indent" w:semiHidden="1" w:unhideWhenUsed="1"/>
-    <w:lsdException w:name="Body Text First Indent 2" w:semiHidden="1" w:unhideWhenUsed="1"/>
-    <w:lsdException w:name="Note Heading" w:semiHidden="1" w:unhideWhenUsed="1"/>
-    <w:lsdException w:name="Body Text 2" w:semiHidden="1" w:unhideWhenUsed="1"/>
-    <w:lsdException w:name="Body Text 3" w:semiHidden="1" w:unhideWhenUsed="1"/>
-    <w:lsdException w:name="Body Text Indent 2" w:semiHidden="1" w:unhideWhenUsed="1"/>
-    <w:lsdException w:name="Body Text Indent 3" w:semiHidden="1" w:unhideWhenUsed="1"/>
-    <w:lsdException w:name="Block Text" w:semiHidden="1" w:unhideWhenUsed="1"/>
-    <w:lsdException w:name="Hyperlink" w:semiHidden="1" w:unhideWhenUsed="1"/>
-    <w:lsdException w:name="FollowedHyperlink" w:semiHidden="1" w:unhideWhenUsed="1"/>
-    <w:lsdException w:name="Strong" w:uiPriority="22" w:qFormat="1"/>
-    <w:lsdException w:name="Emphasis" w:uiPriority="20" w:qFormat="1"/>
-    <w:lsdException w:name="Document Map" w:semiHidden="1" w:unhideWhenUsed="1"/>
-    <w:lsdException w:name="Plain Text" w:semiHidden="1" w:unhideWhenUsed="1"/>
-    <w:lsdException w:name="E-mail Signature" w:semiHidden="1" w:unhideWhenUsed="1"/>
-    <w:lsdException w:name="HTML Top of Form" w:semiHidden="1" w:unhideWhenUsed="1"/>
-    <w:lsdException w:name="HTML Bottom of Form" w:semiHidden="1" w:unhideWhenUsed="1"/>
-    <w:lsdException w:name="Normal (Web)" w:semiHidden="1" w:unhideWhenUsed="1"/>
-    <w:lsdException w:name="HTML Acronym" w:semiHidden="1" w:unhideWhenUsed="1"/>
-    <w:lsdException w:name="HTML Address" w:semiHidden="1" w:unhideWhenUsed="1"/>
-    <w:lsdException w:name="HTML Cite" w:semiHidden="1" w:unhideWhenUsed="1"/>
-    <w:lsdException w:name="HTML Code" w:semiHidden="1" w:unhideWhenUsed="1"/>
-    <w:lsdException w:name="HTML Definition" w:semiHidden="1" w:unhideWhenUsed="1"/>
-    <w:lsdException w:name="HTML Keyboard" w:semiHidden="1" w:unhideWhenUsed="1"/>
-    <w:lsdException w:name="HTML Preformatted" w:semiHidden="1" w:unhideWhenUsed="1"/>
-    <w:lsdException w:name="HTML Sample" w:semiHidden="1" w:unhideWhenUsed="1"/>
-    <w:lsdException w:name="HTML Typewriter" w:semiHidden="1" w:unhideWhenUsed="1"/>
-    <w:lsdException w:name="HTML Variable" w:semiHidden="1" w:unhideWhenUsed="1"/>
-    <w:lsdException w:name="Normal Table" w:semiHidden="1" w:unhideWhenUsed="1"/>
-    <w:lsdException w:name="annotation subject" w:semiHidden="1" w:unhideWhenUsed="1"/>
-    <w:lsdException w:name="No List" w:semiHidden="1" w:unhideWhenUsed="1"/>
-    <w:lsdException w:name="Outline List 1" w:semiHidden="1" w:unhideWhenUsed="1"/>
-    <w:lsdException w:name="Outline List 2" w:semiHidden="1" w:unhideWhenUsed="1"/>
-    <w:lsdException w:name="Outline List 3" w:semiHidden="1" w:unhideWhenUsed="1"/>
-    <w:lsdException w:name="Table Simple 1" w:semiHidden="1" w:unhideWhenUsed="1"/>
-    <w:lsdException w:name="Table Simple 2" w:semiHidden="1" w:unhideWhenUsed="1"/>
-    <w:lsdException w:name="Table Simple 3" w:semiHidden="1" w:unhideWhenUsed="1"/>
-    <w:lsdException w:name="Table Classic 1" w:semiHidden="1" w:unhideWhenUsed="1"/>
-    <w:lsdException w:name="Table Classic 2" w:semiHidden="1" w:unhideWhenUsed="1"/>
-    <w:lsdException w:name="Table Classic 3" w:semiHidden="1" w:unhideWhenUsed="1"/>
-    <w:lsdException w:name="Table Classic 4" w:semiHidden="1" w:unhideWhenUsed="1"/>
-    <w:lsdException w:name="Table Colorful 1" w:semiHidden="1" w:unhideWhenUsed="1"/>
-    <w:lsdException w:name="Table Colorful 2" w:semiHidden="1" w:unhideWhenUsed="1"/>
-    <w:lsdException w:name="Table Colorful 3" w:semiHidden="1" w:unhideWhenUsed="1"/>
-    <w:lsdException w:name="Table Columns 1" w:semiHidden="1" w:unhideWhenUsed="1"/>
-    <w:lsdException w:name="Table Columns 2" w:semiHidden="1" w:unhideWhenUsed="1"/>
-    <w:lsdException w:name="Table Columns 3" w:semiHidden="1" w:unhideWhenUsed="1"/>
-    <w:lsdException w:name="Table Columns 4" w:semiHidden="1" w:unhideWhenUsed="1"/>
-    <w:lsdException w:name="Table Columns 5" w:semiHidden="1" w:unhideWhenUsed="1"/>
-    <w:lsdException w:name="Table Grid 1" w:semiHidden="1" w:unhideWhenUsed="1"/>
-    <w:lsdException w:name="Table Grid 2" w:semiHidden="1" w:unhideWhenUsed="1"/>
-    <w:lsdException w:name="Table Grid 3" w:semiHidden="1" w:unhideWhenUsed="1"/>
-    <w:lsdException w:name="Table Grid 4" w:semiHidden="1" w:unhideWhenUsed="1"/>
-    <w:lsdException w:name="Table Grid 5" w:semiHidden="1" w:unhideWhenUsed="1"/>
-    <w:lsdException w:name="Table Grid 6" w:semiHidden="1" w:unhideWhenUsed="1"/>
-    <w:lsdException w:name="Table Grid 7" w:semiHidden="1" w:unhideWhenUsed="1"/>
-    <w:lsdException w:name="Table Grid 8" w:semiHidden="1" w:unhideWhenUsed="1"/>
-    <w:lsdException w:name="Table List 1" w:semiHidden="1" w:unhideWhenUsed="1"/>
-    <w:lsdException w:name="Table List 2" w:semiHidden="1" w:unhideWhenUsed="1"/>
-    <w:lsdException w:name="Table List 3" w:semiHidden="1" w:unhideWhenUsed="1"/>
-    <w:lsdException w:name="Table List 4" w:semiHidden="1" w:unhideWhenUsed="1"/>
-    <w:lsdException w:name="Table List 5" w:semiHidden="1" w:unhideWhenUsed="1"/>
-    <w:lsdException w:name="Table List 6" w:semiHidden="1" w:unhideWhenUsed="1"/>
-    <w:lsdException w:name="Table List 7" w:semiHidden="1" w:unhideWhenUsed="1"/>
-    <w:lsdException w:name="Table List 8" w:semiHidden="1" w:unhideWhenUsed="1"/>
-    <w:lsdException w:name="Table 3D effects 1" w:semiHidden="1" w:unhideWhenUsed="1"/>
-    <w:lsdException w:name="Table 3D effects 2" w:semiHidden="1" w:unhideWhenUsed="1"/>
-    <w:lsdException w:name="Table 3D effects 3" w:semiHidden="1" w:unhideWhenUsed="1"/>
-    <w:lsdException w:name="Table Contemporary" w:semiHidden="1" w:unhideWhenUsed="1"/>
-    <w:lsdException w:name="Table Elegant" w:semiHidden="1" w:unhideWhenUsed="1"/>
-    <w:lsdException w:name="Table Professional" w:semiHidden="1" w:unhideWhenUsed="1"/>
-    <w:lsdException w:name="Table Subtle 1" w:semiHidden="1" w:unhideWhenUsed="1"/>
-    <w:lsdException w:name="Table Subtle 2" w:semiHidden="1" w:unhideWhenUsed="1"/>
-    <w:lsdException w:name="Table Web 1" w:semiHidden="1" w:unhideWhenUsed="1"/>
-    <w:lsdException w:name="Table Web 2" w:semiHidden="1" w:unhideWhenUsed="1"/>
-    <w:lsdException w:name="Table Web 3" w:semiHidden="1" w:unhideWhenUsed="1"/>
-    <w:lsdException w:name="Balloon Text" w:semiHidden="1" w:unhideWhenUsed="1"/>
-    <w:lsdException w:name="Table Grid" w:uiPriority="39"/>
-    <w:lsdException w:name="Table Theme" w:semiHidden="1" w:unhideWhenUsed="1"/>
-    <w:lsdException w:name="Placeholder Text" w:semiHidden="1"/>
-    <w:lsdException w:name="No Spacing" w:uiPriority="1" w:qFormat="1"/>
-    <w:lsdException w:name="Light Shading" w:uiPriority="60"/>
-    <w:lsdException w:name="Light List" w:uiPriority="61"/>
-    <w:lsdException w:name="Light Grid" w:uiPriority="62"/>
-    <w:lsdException w:name="Medium Shading 1" w:uiPriority="63"/>
-    <w:lsdException w:name="Medium Shading 2" w:uiPriority="64"/>
-    <w:lsdException w:name="Medium List 1" w:uiPriority="65"/>
-    <w:lsdException w:name="Medium List 2" w:uiPriority="66"/>
-    <w:lsdException w:name="Medium Grid 1" w:uiPriority="67"/>
-    <w:lsdException w:name="Medium Grid 2" w:uiPriority="68"/>
-    <w:lsdException w:name="Medium Grid 3" w:uiPriority="69"/>
-    <w:lsdException w:name="Dark List" w:uiPriority="70"/>
-    <w:lsdException w:name="Colorful Shading" w:uiPriority="71"/>
-    <w:lsdException w:name="Colorful List" w:uiPriority="72"/>
-    <w:lsdException w:name="Colorful Grid" w:uiPriority="73"/>
-    <w:lsdException w:name="Light Shading Accent 1" w:uiPriority="60"/>
-    <w:lsdException w:name="Light List Accent 1" w:uiPriority="61"/>
-    <w:lsdException w:name="Light Grid Accent 1" w:uiPriority="62"/>
-    <w:lsdException w:name="Medium Shading 1 Accent 1" w:uiPriority="63"/>
-    <w:lsdException w:name="Medium Shading 2 Accent 1" w:uiPriority="64"/>
-    <w:lsdException w:name="Medium List 1 Accent 1" w:uiPriority="65"/>
-    <w:lsdException w:name="Revision" w:semiHidden="1"/>
-    <w:lsdException w:name="List Paragraph" w:uiPriority="34" w:qFormat="1"/>
-    <w:lsdException w:name="Quote" w:uiPriority="29" w:qFormat="1"/>
-    <w:lsdException w:name="Intense Quote" w:uiPriority="30" w:qFormat="1"/>
-    <w:lsdException w:name="Medium List 2 Accent 1" w:uiPriority="66"/>
-    <w:lsdException w:name="Medium Grid 1 Accent 1" w:uiPriority="67"/>
-    <w:lsdException w:name="Medium Grid 2 Accent 1" w:uiPriority="68"/>
-    <w:lsdException w:name="Medium Grid 3 Accent 1" w:uiPriority="69"/>
-    <w:lsdException w:name="Dark List Accent 1" w:uiPriority="70"/>
-    <w:lsdException w:name="Colorful Shading Accent 1" w:uiPriority="71"/>
-    <w:lsdException w:name="Colorful List Accent 1" w:uiPriority="72"/>
-    <w:lsdException w:name="Colorful Grid Accent 1" w:uiPriority="73"/>
-    <w:lsdException w:name="Light Shading Accent 2" w:uiPriority="60"/>
-    <w:lsdException w:name="Light List Accent 2" w:uiPriority="61"/>
-    <w:lsdException w:name="Light Grid Accent 2" w:uiPriority="62"/>
-    <w:lsdException w:name="Medium Shading 1 Accent 2" w:uiPriority="63"/>
-    <w:lsdException w:name="Medium Shading 2 Accent 2" w:uiPriority="64"/>
-    <w:lsdException w:name="Medium List 1 Accent 2" w:uiPriority="65"/>
-    <w:lsdException w:name="Medium List 2 Accent 2" w:uiPriority="66"/>
-    <w:lsdException w:name="Medium Grid 1 Accent 2" w:uiPriority="67"/>
-    <w:lsdException w:name="Medium Grid 2 Accent 2" w:uiPriority="68"/>
-    <w:lsdException w:name="Medium Grid 3 Accent 2" w:uiPriority="69"/>
-    <w:lsdException w:name="Dark List Accent 2" w:uiPriority="70"/>
-    <w:lsdException w:name="Colorful Shading Accent 2" w:uiPriority="71"/>
-    <w:lsdException w:name="Colorful List Accent 2" w:uiPriority="72"/>
-    <w:lsdException w:name="Colorful Grid Accent 2" w:uiPriority="73"/>
-    <w:lsdException w:name="Light Shading Accent 3" w:uiPriority="60"/>
-    <w:lsdException w:name="Light List Accent 3" w:uiPriority="61"/>
-    <w:lsdException w:name="Light Grid Accent 3" w:uiPriority="62"/>
-    <w:lsdException w:name="Medium Shading 1 Accent 3" w:uiPriority="63"/>
-    <w:lsdException w:name="Medium Shading 2 Accent 3" w:uiPriority="64"/>
-    <w:lsdException w:name="Medium List 1 Accent 3" w:uiPriority="65"/>
-    <w:lsdException w:name="Medium List 2 Accent 3" w:uiPriority="66"/>
-    <w:lsdException w:name="Medium Grid 1 Accent 3" w:uiPriority="67"/>
-    <w:lsdException w:name="Medium Grid 2 Accent 3" w:uiPriority="68"/>
-    <w:lsdException w:name="Medium Grid 3 Accent 3" w:uiPriority="69"/>
-    <w:lsdException w:name="Dark List Accent 3" w:uiPriority="70"/>
-    <w:lsdException w:name="Colorful Shading Accent 3" w:uiPriority="71"/>
-    <w:lsdException w:name="Colorful List Accent 3" w:uiPriority="72"/>
-    <w:lsdException w:name="Colorful Grid Accent 3" w:uiPriority="73"/>
-    <w:lsdException w:name="Light Shading Accent 4" w:uiPriority="60"/>
-    <w:lsdException w:name="Light List Accent 4" w:uiPriority="61"/>
-    <w:lsdException w:name="Light Grid Accent 4" w:uiPriority="62"/>
-    <w:lsdException w:name="Medium Shading 1 Accent 4" w:uiPriority="63"/>
-    <w:lsdException w:name="Medium Shading 2 Accent 4" w:uiPriority="64"/>
-    <w:lsdException w:name="Medium List 1 Accent 4" w:uiPriority="65"/>
-    <w:lsdException w:name="Medium List 2 Accent 4" w:uiPriority="66"/>
-    <w:lsdException w:name="Medium Grid 1 Accent 4" w:uiPriority="67"/>
-    <w:lsdException w:name="Medium Grid 2 Accent 4" w:uiPriority="68"/>
-    <w:lsdException w:name="Medium Grid 3 Accent 4" w:uiPriority="69"/>
-    <w:lsdException w:name="Dark List Accent 4" w:uiPriority="70"/>
-    <w:lsdException w:name="Colorful Shading Accent 4" w:uiPriority="71"/>
-    <w:lsdException w:name="Colorful List Accent 4" w:uiPriority="72"/>
-    <w:lsdException w:name="Colorful Grid Accent 4" w:uiPriority="73"/>
-    <w:lsdException w:name="Light Shading Accent 5" w:uiPriority="60"/>
-    <w:lsdException w:name="Light List Accent 5" w:uiPriority="61"/>
-    <w:lsdException w:name="Light Grid Accent 5" w:uiPriority="62"/>
-    <w:lsdException w:name="Medium Shading 1 Accent 5" w:uiPriority="63"/>
-    <w:lsdException w:name="Medium Shading 2 Accent 5" w:uiPriority="64"/>
-    <w:lsdException w:name="Medium List 1 Accent 5" w:uiPriority="65"/>
-    <w:lsdException w:name="Medium List 2 Accent 5" w:uiPriority="66"/>
-    <w:lsdException w:name="Medium Grid 1 Accent 5" w:uiPriority="67"/>
-    <w:lsdException w:name="Medium Grid 2 Accent 5" w:uiPriority="68"/>
-    <w:lsdException w:name="Medium Grid 3 Accent 5" w:uiPriority="69"/>
-    <w:lsdException w:name="Dark List Accent 5" w:uiPriority="70"/>
-    <w:lsdException w:name="Colorful Shading Accent 5" w:uiPriority="71"/>
-    <w:lsdException w:name="Colorful List Accent 5" w:uiPriority="72"/>
-    <w:lsdException w:name="Colorful Grid Accent 5" w:uiPriority="73"/>
-    <w:lsdException w:name="Light Shading Accent 6" w:uiPriority="60"/>
-    <w:lsdException w:name="Light List Accent 6" w:uiPriority="61"/>
-    <w:lsdException w:name="Light Grid Accent 6" w:uiPriority="62"/>
-    <w:lsdException w:name="Medium Shading 1 Accent 6" w:uiPriority="63"/>
-    <w:lsdException w:name="Medium Shading 2 Accent 6" w:uiPriority="64"/>
-    <w:lsdException w:name="Medium List 1 Accent 6" w:uiPriority="65"/>
-    <w:lsdException w:name="Medium List 2 Accent 6" w:uiPriority="66"/>
-    <w:lsdException w:name="Medium Grid 1 Accent 6" w:uiPriority="67"/>
-    <w:lsdException w:name="Medium Grid 2 Accent 6" w:uiPriority="68"/>
-    <w:lsdException w:name="Medium Grid 3 Accent 6" w:uiPriority="69"/>
-    <w:lsdException w:name="Dark List Accent 6" w:uiPriority="70"/>
-    <w:lsdException w:name="Colorful Shading Accent 6" w:uiPriority="71"/>
-    <w:lsdException w:name="Colorful List Accent 6" w:uiPriority="72"/>
-    <w:lsdException w:name="Colorful Grid Accent 6" w:uiPriority="73"/>
-    <w:lsdException w:name="Subtle Emphasis" w:uiPriority="19" w:qFormat="1"/>
-    <w:lsdException w:name="Intense Emphasis" w:uiPriority="21" w:qFormat="1"/>
-    <w:lsdException w:name="Subtle Reference" w:uiPriority="31" w:qFormat="1"/>
-    <w:lsdException w:name="Intense Reference" w:uiPriority="32" w:qFormat="1"/>
-    <w:lsdException w:name="Book Title" w:uiPriority="33" w:qFormat="1"/>
-    <w:lsdException w:name="Bibliography" w:semiHidden="1" w:uiPriority="37" w:unhideWhenUsed="1"/>
-    <w:lsdException w:name="TOC Heading" w:semiHidden="1" w:uiPriority="39" w:unhideWhenUsed="1" w:qFormat="1"/>
-    <w:lsdException w:name="Plain Table 1" w:uiPriority="41"/>
-    <w:lsdException w:name="Plain Table 2" w:uiPriority="42"/>
-    <w:lsdException w:name="Plain Table 3" w:uiPriority="43"/>
-    <w:lsdException w:name="Plain Table 4" w:uiPriority="44"/>
-    <w:lsdException w:name="Plain Table 5" w:uiPriority="45"/>
-    <w:lsdException w:name="Grid Table Light" w:uiPriority="40"/>
-    <w:lsdException w:name="Grid Table 1 Light" w:uiPriority="46"/>
-    <w:lsdException w:name="Grid Table 2" w:uiPriority="47"/>
-    <w:lsdException w:name="Grid Table 3" w:uiPriority="48"/>
-    <w:lsdException w:name="Grid Table 4" w:uiPriority="49"/>
-    <w:lsdException w:name="Grid Table 5 Dark" w:uiPriority="50"/>
-    <w:lsdException w:name="Grid Table 6 Colorful" w:uiPriority="51"/>
-    <w:lsdException w:name="Grid Table 7 Colorful" w:uiPriority="52"/>
-    <w:lsdException w:name="Grid Table 1 Light Accent 1" w:uiPriority="46"/>
-    <w:lsdException w:name="Grid Table 2 Accent 1" w:uiPriority="47"/>
-    <w:lsdException w:name="Grid Table 3 Accent 1" w:uiPriority="48"/>
-    <w:lsdException w:name="Grid Table 4 Accent 1" w:uiPriority="49"/>
-    <w:lsdException w:name="Grid Table 5 Dark Accent 1" w:uiPriority="50"/>
-    <w:lsdException w:name="Grid Table 6 Colorful Accent 1" w:uiPriority="51"/>
-    <w:lsdException w:name="Grid Table 7 Colorful Accent 1" w:uiPriority="52"/>
-    <w:lsdException w:name="Grid Table 1 Light Accent 2" w:uiPriority="46"/>
-    <w:lsdException w:name="Grid Table 2 Accent 2" w:uiPriority="47"/>
-    <w:lsdException w:name="Grid Table 3 Accent 2" w:uiPriority="48"/>
-    <w:lsdException w:name="Grid Table 4 Accent 2" w:uiPriority="49"/>
-    <w:lsdException w:name="Grid Table 5 Dark Accent 2" w:uiPriority="50"/>
-    <w:lsdException w:name="Grid Table 6 Colorful Accent 2" w:uiPriority="51"/>
-    <w:lsdException w:name="Grid Table 7 Colorful Accent 2" w:uiPriority="52"/>
-    <w:lsdException w:name="Grid Table 1 Light Accent 3" w:uiPriority="46"/>
-    <w:lsdException w:name="Grid Table 2 Accent 3" w:uiPriority="47"/>
-    <w:lsdException w:name="Grid Table 3 Accent 3" w:uiPriority="48"/>
-    <w:lsdException w:name="Grid Table 4 Accent 3" w:uiPriority="49"/>
-    <w:lsdException w:name="Grid Table 5 Dark Accent 3" w:uiPriority="50"/>
-    <w:lsdException w:name="Grid Table 6 Colorful Accent 3" w:uiPriority="51"/>
-    <w:lsdException w:name="Grid Table 7 Colorful Accent 3" w:uiPriority="52"/>
-    <w:lsdException w:name="Grid Table 1 Light Accent 4" w:uiPriority="46"/>
-    <w:lsdException w:name="Grid Table 2 Accent 4" w:uiPriority="47"/>
-    <w:lsdException w:name="Grid Table 3 Accent 4" w:uiPriority="48"/>
-    <w:lsdException w:name="Grid Table 4 Accent 4" w:uiPriority="49"/>
-    <w:lsdException w:name="Grid Table 5 Dark Accent 4" w:uiPriority="50"/>
-    <w:lsdException w:name="Grid Table 6 Colorful Accent 4" w:uiPriority="51"/>
-    <w:lsdException w:name="Grid Table 7 Colorful Accent 4" w:uiPriority="52"/>
-    <w:lsdException w:name="Grid Table 1 Light Accent 5" w:uiPriority="46"/>
-    <w:lsdException w:name="Grid Table 2 Accent 5" w:uiPriority="47"/>
-    <w:lsdException w:name="Grid Table 3 Accent 5" w:uiPriority="48"/>
-    <w:lsdException w:name="Grid Table 4 Accent 5" w:uiPriority="49"/>
-    <w:lsdException w:name="Grid Table 5 Dark Accent 5" w:uiPriority="50"/>
-    <w:lsdException w:name="Grid Table 6 Colorful Accent 5" w:uiPriority="51"/>
-    <w:lsdException w:name="Grid Table 7 Colorful Accent 5" w:uiPriority="52"/>
-    <w:lsdException w:name="Grid Table 1 Light Accent 6" w:uiPriority="46"/>
-    <w:lsdException w:name="Grid Table 2 Accent 6" w:uiPriority="47"/>
-    <w:lsdException w:name="Grid Table 3 Accent 6" w:uiPriority="48"/>
-    <w:lsdException w:name="Grid Table 4 Accent 6" w:uiPriority="49"/>
-    <w:lsdException w:name="Grid Table 5 Dark Accent 6" w:uiPriority="50"/>
-    <w:lsdException w:name="Grid Table 6 Colorful Accent 6" w:uiPriority="51"/>
-    <w:lsdException w:name="Grid Table 7 Colorful Accent 6" w:uiPriority="52"/>
-    <w:lsdException w:name="List Table 1 Light" w:uiPriority="46"/>
-    <w:lsdException w:name="List Table 2" w:uiPriority="47"/>
-    <w:lsdException w:name="List Table 3" w:uiPriority="48"/>
-    <w:lsdException w:name="List Table 4" w:uiPriority="49"/>
-    <w:lsdException w:name="List Table 5 Dark" w:uiPriority="50"/>
-    <w:lsdException w:name="List Table 6 Colorful" w:uiPriority="51"/>
-    <w:lsdException w:name="List Table 7 Colorful" w:uiPriority="52"/>
-    <w:lsdException w:name="List Table 1 Light Accent 1" w:uiPriority="46"/>
-    <w:lsdException w:name="List Table 2 Accent 1" w:uiPriority="47"/>
-    <w:lsdException w:name="List Table 3 Accent 1" w:uiPriority="48"/>
-    <w:lsdException w:name="List Table 4 Accent 1" w:uiPriority="49"/>
-    <w:lsdException w:name="List Table 5 Dark Accent 1" w:uiPriority="50"/>
-    <w:lsdException w:name="List Table 6 Colorful Accent 1" w:uiPriority="51"/>
-    <w:lsdException w:name="List Table 7 Colorful Accent 1" w:uiPriority="52"/>
-    <w:lsdException w:name="List Table 1 Light Accent 2" w:uiPriority="46"/>
-    <w:lsdException w:name="List Table 2 Accent 2" w:uiPriority="47"/>
-    <w:lsdException w:name="List Table 3 Accent 2" w:uiPriority="48"/>
-    <w:lsdException w:name="List Table 4 Accent 2" w:uiPriority="49"/>
-    <w:lsdException w:name="List Table 5 Dark Accent 2" w:uiPriority="50"/>
-    <w:lsdException w:name="List Table 6 Colorful Accent 2" w:uiPriority="51"/>
-    <w:lsdException w:name="List Table 7 Colorful Accent 2" w:uiPriority="52"/>
-    <w:lsdException w:name="List Table 1 Light Accent 3" w:uiPriority="46"/>
-    <w:lsdException w:name="List Table 2 Accent 3" w:uiPriority="47"/>
-    <w:lsdException w:name="List Table 3 Accent 3" w:uiPriority="48"/>
-    <w:lsdException w:name="List Table 4 Accent 3" w:uiPriority="49"/>
-    <w:lsdException w:name="List Table 5 Dark Accent 3" w:uiPriority="50"/>
-    <w:lsdException w:name="List Table 6 Colorful Accent 3" w:uiPriority="51"/>
-    <w:lsdException w:name="List Table 7 Colorful Accent 3" w:uiPriority="52"/>
-    <w:lsdException w:name="List Table 1 Light Accent 4" w:uiPriority="46"/>
-    <w:lsdException w:name="List Table 2 Accent 4" w:uiPriority="47"/>
-    <w:lsdException w:name="List Table 3 Accent 4" w:uiPriority="48"/>
-    <w:lsdException w:name="List Table 4 Accent 4" w:uiPriority="49"/>
-    <w:lsdException w:name="List Table 5 Dark Accent 4" w:uiPriority="50"/>
-    <w:lsdException w:name="List Table 6 Colorful Accent 4" w:uiPriority="51"/>
-    <w:lsdException w:name="List Table 7 Colorful Accent 4" w:uiPriority="52"/>
-    <w:lsdException w:name="List Table 1 Light Accent 5" w:uiPriority="46"/>
-    <w:lsdException w:name="List Table 2 Accent 5" w:uiPriority="47"/>
-    <w:lsdException w:name="List Table 3 Accent 5" w:uiPriority="48"/>
-    <w:lsdException w:name="List Table 4 Accent 5" w:uiPriority="49"/>
-    <w:lsdException w:name="List Table 5 Dark Accent 5" w:uiPriority="50"/>
-    <w:lsdException w:name="List Table 6 Colorful Accent 5" w:uiPriority="51"/>
-    <w:lsdException w:name="List Table 7 Colorful Accent 5" w:uiPriority="52"/>
-    <w:lsdException w:name="List Table 1 Light Accent 6" w:uiPriority="46"/>
-    <w:lsdException w:name="List Table 2 Accent 6" w:uiPriority="47"/>
-    <w:lsdException w:name="List Table 3 Accent 6" w:uiPriority="48"/>
-    <w:lsdException w:name="List Table 4 Accent 6" w:uiPriority="49"/>
-    <w:lsdException w:name="List Table 5 Dark Accent 6" w:uiPriority="50"/>
-    <w:lsdException w:name="List Table 6 Colorful Accent 6" w:uiPriority="51"/>
-    <w:lsdException w:name="List Table 7 Colorful Accent 6" w:uiPriority="52"/>
-  </w:latentStyles>
-  <w:style w:type="paragraph" w:default="1" w:styleId="Normal">
-    <w:name w:val="Normal"/>
-    <w:qFormat/>
-  </w:style>
-  <w:style w:type="character" w:default="1" w:styleId="Fuentedeprrafopredeter">
-    <w:name w:val="Default Paragraph Font"/>
-    <w:uiPriority w:val="1"/>
-    <w:semiHidden/>
-    <w:unhideWhenUsed/>
-  </w:style>
-  <w:style w:type="table" w:default="1" w:styleId="Tablanormal">
-    <w:name w:val="Normal Table"/>
-    <w:uiPriority w:val="99"/>
-    <w:semiHidden/>
-    <w:unhideWhenUsed/>
-    <w:tblPr>
-      <w:tblInd w:w="0" w:type="dxa"/>
-      <w:tblCellMar>
-        <w:top w:w="0" w:type="dxa"/>
-        <w:left w:w="108" w:type="dxa"/>
-        <w:bottom w:w="0" w:type="dxa"/>
-        <w:right w:w="108" w:type="dxa"/>
-      </w:tblCellMar>
-    </w:tblPr>
-  </w:style>
-  <w:style w:type="numbering" w:default="1" w:styleId="Sinlista">
-    <w:name w:val="No List"/>
-    <w:uiPriority w:val="99"/>
-    <w:semiHidden/>
-    <w:unhideWhenUsed/>
-  </w:style>
-</w:styles>
-</file>
-
-<file path=word/glossary/webSettings.xml><?xml version="1.0" encoding="utf-8"?>
-<w:webSettings xmlns:mc="http://schemas.openxmlformats.org/markup-compatibility/2006" xmlns:r="http://schemas.openxmlformats.org/officeDocument/2006/relationships" xmlns:w="http://schemas.openxmlformats.org/wordprocessingml/2006/main" xmlns:w14="http://schemas.microsoft.com/office/word/2010/wordml" xmlns:w15="http://schemas.microsoft.com/office/word/2012/wordml" xmlns:w16se="http://schemas.microsoft.com/office/word/2015/wordml/symex" mc:Ignorable="w14 w15 w16se"/>
 </file>
 
 <file path=word/theme/theme1.xml><?xml version="1.0" encoding="utf-8"?>
@@ -9000,6 +8483,25 @@
 </file>
 
 <file path=customXml/item1.xml><?xml version="1.0" encoding="utf-8"?>
+<b:Sources xmlns:b="http://schemas.openxmlformats.org/officeDocument/2006/bibliography" xmlns="http://schemas.openxmlformats.org/officeDocument/2006/bibliography" SelectedStyle="\APASixthEditionOfficeOnline.xsl" StyleName="APA" Version="6"/>
+</file>
+
+<file path=customXml/item2.xml><?xml version="1.0" encoding="utf-8"?>
+<?mso-contentType ?>
+<FormTemplates xmlns="http://schemas.microsoft.com/sharepoint/v3/contenttype/forms">
+  <Display>DocumentLibraryForm</Display>
+  <Edit>DocumentLibraryForm</Edit>
+  <New>DocumentLibraryForm</New>
+</FormTemplates>
+</file>
+
+<file path=customXml/item3.xml><?xml version="1.0" encoding="utf-8"?>
+<p:properties xmlns:p="http://schemas.microsoft.com/office/2006/metadata/properties" xmlns:xsi="http://www.w3.org/2001/XMLSchema-instance" xmlns:pc="http://schemas.microsoft.com/office/infopath/2007/PartnerControls">
+  <documentManagement/>
+</p:properties>
+</file>
+
+<file path=customXml/item4.xml><?xml version="1.0" encoding="utf-8"?>
 <ct:contentTypeSchema xmlns:ct="http://schemas.microsoft.com/office/2006/metadata/contentType" xmlns:ma="http://schemas.microsoft.com/office/2006/metadata/properties/metaAttributes" ct:_="" ma:_="" ma:contentTypeName="Documento" ma:contentTypeID="0x010100E96778489EE7714D8BD12CC105EB918B" ma:contentTypeVersion="2" ma:contentTypeDescription="Crear nuevo documento." ma:contentTypeScope="" ma:versionID="416c5c7ae9b5d54d83875cd3c65194e3">
   <xsd:schema xmlns:xsd="http://www.w3.org/2001/XMLSchema" xmlns:xs="http://www.w3.org/2001/XMLSchema" xmlns:p="http://schemas.microsoft.com/office/2006/metadata/properties" xmlns:ns2="126e8a1c-9ea9-435a-ac89-d06c80d62e30" targetNamespace="http://schemas.microsoft.com/office/2006/metadata/properties" ma:root="true" ma:fieldsID="70a237c842677bd850644f8595079f5e" ns2:_="">
     <xsd:import namespace="126e8a1c-9ea9-435a-ac89-d06c80d62e30"/>
@@ -9131,26 +8633,32 @@
 </ct:contentTypeSchema>
 </file>
 
-<file path=customXml/item2.xml><?xml version="1.0" encoding="utf-8"?>
-<p:properties xmlns:p="http://schemas.microsoft.com/office/2006/metadata/properties" xmlns:xsi="http://www.w3.org/2001/XMLSchema-instance" xmlns:pc="http://schemas.microsoft.com/office/infopath/2007/PartnerControls">
-  <documentManagement/>
-</p:properties>
+<file path=customXml/itemProps1.xml><?xml version="1.0" encoding="utf-8"?>
+<ds:datastoreItem xmlns:ds="http://schemas.openxmlformats.org/officeDocument/2006/customXml" ds:itemID="{FBD61725-A60E-40F3-AB5D-0E7F797DD77D}">
+  <ds:schemaRefs>
+    <ds:schemaRef ds:uri="http://schemas.openxmlformats.org/officeDocument/2006/bibliography"/>
+  </ds:schemaRefs>
+</ds:datastoreItem>
 </file>
 
-<file path=customXml/item3.xml><?xml version="1.0" encoding="utf-8"?>
-<?mso-contentType ?>
-<FormTemplates xmlns="http://schemas.microsoft.com/sharepoint/v3/contenttype/forms">
-  <Display>DocumentLibraryForm</Display>
-  <Edit>DocumentLibraryForm</Edit>
-  <New>DocumentLibraryForm</New>
-</FormTemplates>
+<file path=customXml/itemProps2.xml><?xml version="1.0" encoding="utf-8"?>
+<ds:datastoreItem xmlns:ds="http://schemas.openxmlformats.org/officeDocument/2006/customXml" ds:itemID="{DABAA964-10BA-4DBC-ABF2-CDEAC0FAF7AA}">
+  <ds:schemaRefs>
+    <ds:schemaRef ds:uri="http://schemas.microsoft.com/sharepoint/v3/contenttype/forms"/>
+  </ds:schemaRefs>
+</ds:datastoreItem>
 </file>
 
-<file path=customXml/item4.xml><?xml version="1.0" encoding="utf-8"?>
-<b:Sources xmlns:b="http://schemas.openxmlformats.org/officeDocument/2006/bibliography" xmlns="http://schemas.openxmlformats.org/officeDocument/2006/bibliography" SelectedStyle="\APASixthEditionOfficeOnline.xsl" StyleName="APA" Version="6"/>
+<file path=customXml/itemProps3.xml><?xml version="1.0" encoding="utf-8"?>
+<ds:datastoreItem xmlns:ds="http://schemas.openxmlformats.org/officeDocument/2006/customXml" ds:itemID="{5F1783E3-BA1C-4CA3-8E32-C9B378BBED03}">
+  <ds:schemaRefs>
+    <ds:schemaRef ds:uri="http://schemas.microsoft.com/office/2006/metadata/properties"/>
+    <ds:schemaRef ds:uri="http://schemas.microsoft.com/office/infopath/2007/PartnerControls"/>
+  </ds:schemaRefs>
+</ds:datastoreItem>
 </file>
 
-<file path=customXml/itemProps1.xml><?xml version="1.0" encoding="utf-8"?>
+<file path=customXml/itemProps4.xml><?xml version="1.0" encoding="utf-8"?>
 <ds:datastoreItem xmlns:ds="http://schemas.openxmlformats.org/officeDocument/2006/customXml" ds:itemID="{DF0582E6-0C2C-40A6-8E3D-E410E41021C1}">
   <ds:schemaRefs>
     <ds:schemaRef ds:uri="http://schemas.microsoft.com/office/2006/metadata/contentType"/>
@@ -9166,36 +8674,4 @@
     <ds:schemaRef ds:uri="http://schemas.microsoft.com/internal/obd"/>
   </ds:schemaRefs>
 </ds:datastoreItem>
-</file>
-
-<file path=customXml/itemProps2.xml><?xml version="1.0" encoding="utf-8"?>
-<ds:datastoreItem xmlns:ds="http://schemas.openxmlformats.org/officeDocument/2006/customXml" ds:itemID="{5F1783E3-BA1C-4CA3-8E32-C9B378BBED03}">
-  <ds:schemaRefs>
-    <ds:schemaRef ds:uri="http://schemas.openxmlformats.org/package/2006/metadata/core-properties"/>
-    <ds:schemaRef ds:uri="http://schemas.microsoft.com/office/infopath/2007/PartnerControls"/>
-    <ds:schemaRef ds:uri="http://purl.org/dc/elements/1.1/"/>
-    <ds:schemaRef ds:uri="http://schemas.microsoft.com/office/2006/documentManagement/types"/>
-    <ds:schemaRef ds:uri="http://schemas.microsoft.com/office/2006/metadata/properties"/>
-    <ds:schemaRef ds:uri="126e8a1c-9ea9-435a-ac89-d06c80d62e30"/>
-    <ds:schemaRef ds:uri="http://purl.org/dc/terms/"/>
-    <ds:schemaRef ds:uri="http://purl.org/dc/dcmitype/"/>
-    <ds:schemaRef ds:uri="http://www.w3.org/XML/1998/namespace"/>
-  </ds:schemaRefs>
-</ds:datastoreItem>
-</file>
-
-<file path=customXml/itemProps3.xml><?xml version="1.0" encoding="utf-8"?>
-<ds:datastoreItem xmlns:ds="http://schemas.openxmlformats.org/officeDocument/2006/customXml" ds:itemID="{DABAA964-10BA-4DBC-ABF2-CDEAC0FAF7AA}">
-  <ds:schemaRefs>
-    <ds:schemaRef ds:uri="http://schemas.microsoft.com/sharepoint/v3/contenttype/forms"/>
-  </ds:schemaRefs>
-</ds:datastoreItem>
-</file>
-
-<file path=customXml/itemProps4.xml><?xml version="1.0" encoding="utf-8"?>
-<ds:datastoreItem xmlns:ds="http://schemas.openxmlformats.org/officeDocument/2006/customXml" ds:itemID="{FBD61725-A60E-40F3-AB5D-0E7F797DD77D}">
-  <ds:schemaRefs>
-    <ds:schemaRef ds:uri="http://schemas.openxmlformats.org/officeDocument/2006/bibliography"/>
-  </ds:schemaRefs>
-</ds:datastoreItem>
 </file>
</xml_diff>